<commit_message>
Esquema de calidad, pruebas y conformidad v1.0 y URL de GitHub Pages
- Plan de Pruebas: secciones de Recursos y responsabilidades y de Aprobación,
  según el modelo del docente; criterio de UAT en la aceptación del producto.
- CC03: mensaje esperado corregido según login.html; métrica responsive con 11 páginas.
- Presentación actualizada (25 diapositivas) en línea con el documento.
- URL publicada: https://diegoaaron.github.io/calidadProyecto/

Co-Authored-By: Claude Opus 5.5 <noreply@anthropic.com>
</commit_message>
<xml_diff>
--- a/docs/Esquema_Calidad_Pruebas_Conformidad.docx
+++ b/docs/Esquema_Calidad_Pruebas_Conformidad.docx
@@ -104,7 +104,7 @@
         <w:t xml:space="preserve">Versión: </w:t>
       </w:r>
       <w:r>
-        <w:t>0.1 – Avance</w:t>
+        <w:t>1.0</w:t>
       </w:r>
     </w:p>
     <w:p>
@@ -148,6 +148,7 @@
         <w:alias w:val="Contenido"/>
         <w:id w:val="-659075456"/>
       </w:sdtPr>
+      <w:sdtEndPr/>
       <w:sdtContent>
         <w:p>
           <w:pPr>
@@ -173,7 +174,7 @@
           <w:r>
             <w:fldChar w:fldCharType="separate"/>
           </w:r>
-          <w:hyperlink w:anchor="_Toc241941611" w:history="1">
+          <w:hyperlink w:anchor="_Toc242457315" w:history="1">
             <w:r>
               <w:rPr>
                 <w:rStyle w:val="Hipervnculo"/>
@@ -197,7 +198,7 @@
               <w:rPr>
                 <w:noProof/>
               </w:rPr>
-              <w:instrText xml:space="preserve"> PAGEREF _Toc241941611 \h </w:instrText>
+              <w:instrText xml:space="preserve"> PAGEREF _Toc242457315 \h </w:instrText>
             </w:r>
             <w:r>
               <w:rPr>
@@ -239,7 +240,7 @@
               <w14:ligatures w14:val="standardContextual"/>
             </w:rPr>
           </w:pPr>
-          <w:hyperlink w:anchor="_Toc241941612" w:history="1">
+          <w:hyperlink w:anchor="_Toc242457316" w:history="1">
             <w:r>
               <w:rPr>
                 <w:rStyle w:val="Hipervnculo"/>
@@ -263,7 +264,7 @@
               <w:rPr>
                 <w:noProof/>
               </w:rPr>
-              <w:instrText xml:space="preserve"> PAGEREF _Toc241941612 \h </w:instrText>
+              <w:instrText xml:space="preserve"> PAGEREF _Toc242457316 \h </w:instrText>
             </w:r>
             <w:r>
               <w:rPr>
@@ -305,7 +306,7 @@
               <w14:ligatures w14:val="standardContextual"/>
             </w:rPr>
           </w:pPr>
-          <w:hyperlink w:anchor="_Toc241941613" w:history="1">
+          <w:hyperlink w:anchor="_Toc242457317" w:history="1">
             <w:r>
               <w:rPr>
                 <w:rStyle w:val="Hipervnculo"/>
@@ -329,7 +330,7 @@
               <w:rPr>
                 <w:noProof/>
               </w:rPr>
-              <w:instrText xml:space="preserve"> PAGEREF _Toc241941613 \h </w:instrText>
+              <w:instrText xml:space="preserve"> PAGEREF _Toc242457317 \h </w:instrText>
             </w:r>
             <w:r>
               <w:rPr>
@@ -371,7 +372,7 @@
               <w14:ligatures w14:val="standardContextual"/>
             </w:rPr>
           </w:pPr>
-          <w:hyperlink w:anchor="_Toc241941614" w:history="1">
+          <w:hyperlink w:anchor="_Toc242457318" w:history="1">
             <w:r>
               <w:rPr>
                 <w:rStyle w:val="Hipervnculo"/>
@@ -395,7 +396,7 @@
               <w:rPr>
                 <w:noProof/>
               </w:rPr>
-              <w:instrText xml:space="preserve"> PAGEREF _Toc241941614 \h </w:instrText>
+              <w:instrText xml:space="preserve"> PAGEREF _Toc242457318 \h </w:instrText>
             </w:r>
             <w:r>
               <w:rPr>
@@ -437,7 +438,7 @@
               <w14:ligatures w14:val="standardContextual"/>
             </w:rPr>
           </w:pPr>
-          <w:hyperlink w:anchor="_Toc241941615" w:history="1">
+          <w:hyperlink w:anchor="_Toc242457319" w:history="1">
             <w:r>
               <w:rPr>
                 <w:rStyle w:val="Hipervnculo"/>
@@ -461,7 +462,7 @@
               <w:rPr>
                 <w:noProof/>
               </w:rPr>
-              <w:instrText xml:space="preserve"> PAGEREF _Toc241941615 \h </w:instrText>
+              <w:instrText xml:space="preserve"> PAGEREF _Toc242457319 \h </w:instrText>
             </w:r>
             <w:r>
               <w:rPr>
@@ -503,7 +504,7 @@
               <w14:ligatures w14:val="standardContextual"/>
             </w:rPr>
           </w:pPr>
-          <w:hyperlink w:anchor="_Toc241941616" w:history="1">
+          <w:hyperlink w:anchor="_Toc242457320" w:history="1">
             <w:r>
               <w:rPr>
                 <w:rStyle w:val="Hipervnculo"/>
@@ -527,7 +528,7 @@
               <w:rPr>
                 <w:noProof/>
               </w:rPr>
-              <w:instrText xml:space="preserve"> PAGEREF _Toc241941616 \h </w:instrText>
+              <w:instrText xml:space="preserve"> PAGEREF _Toc242457320 \h </w:instrText>
             </w:r>
             <w:r>
               <w:rPr>
@@ -569,7 +570,7 @@
               <w14:ligatures w14:val="standardContextual"/>
             </w:rPr>
           </w:pPr>
-          <w:hyperlink w:anchor="_Toc241941617" w:history="1">
+          <w:hyperlink w:anchor="_Toc242457321" w:history="1">
             <w:r>
               <w:rPr>
                 <w:rStyle w:val="Hipervnculo"/>
@@ -593,7 +594,7 @@
               <w:rPr>
                 <w:noProof/>
               </w:rPr>
-              <w:instrText xml:space="preserve"> PAGEREF _Toc241941617 \h </w:instrText>
+              <w:instrText xml:space="preserve"> PAGEREF _Toc242457321 \h </w:instrText>
             </w:r>
             <w:r>
               <w:rPr>
@@ -635,7 +636,7 @@
               <w14:ligatures w14:val="standardContextual"/>
             </w:rPr>
           </w:pPr>
-          <w:hyperlink w:anchor="_Toc241941618" w:history="1">
+          <w:hyperlink w:anchor="_Toc242457322" w:history="1">
             <w:r>
               <w:rPr>
                 <w:rStyle w:val="Hipervnculo"/>
@@ -659,7 +660,7 @@
               <w:rPr>
                 <w:noProof/>
               </w:rPr>
-              <w:instrText xml:space="preserve"> PAGEREF _Toc241941618 \h </w:instrText>
+              <w:instrText xml:space="preserve"> PAGEREF _Toc242457322 \h </w:instrText>
             </w:r>
             <w:r>
               <w:rPr>
@@ -701,7 +702,7 @@
               <w14:ligatures w14:val="standardContextual"/>
             </w:rPr>
           </w:pPr>
-          <w:hyperlink w:anchor="_Toc241941619" w:history="1">
+          <w:hyperlink w:anchor="_Toc242457323" w:history="1">
             <w:r>
               <w:rPr>
                 <w:rStyle w:val="Hipervnculo"/>
@@ -725,7 +726,7 @@
               <w:rPr>
                 <w:noProof/>
               </w:rPr>
-              <w:instrText xml:space="preserve"> PAGEREF _Toc241941619 \h </w:instrText>
+              <w:instrText xml:space="preserve"> PAGEREF _Toc242457323 \h </w:instrText>
             </w:r>
             <w:r>
               <w:rPr>
@@ -767,7 +768,7 @@
               <w14:ligatures w14:val="standardContextual"/>
             </w:rPr>
           </w:pPr>
-          <w:hyperlink w:anchor="_Toc241941620" w:history="1">
+          <w:hyperlink w:anchor="_Toc242457324" w:history="1">
             <w:r>
               <w:rPr>
                 <w:rStyle w:val="Hipervnculo"/>
@@ -791,7 +792,7 @@
               <w:rPr>
                 <w:noProof/>
               </w:rPr>
-              <w:instrText xml:space="preserve"> PAGEREF _Toc241941620 \h </w:instrText>
+              <w:instrText xml:space="preserve"> PAGEREF _Toc242457324 \h </w:instrText>
             </w:r>
             <w:r>
               <w:rPr>
@@ -833,7 +834,7 @@
               <w14:ligatures w14:val="standardContextual"/>
             </w:rPr>
           </w:pPr>
-          <w:hyperlink w:anchor="_Toc241941621" w:history="1">
+          <w:hyperlink w:anchor="_Toc242457325" w:history="1">
             <w:r>
               <w:rPr>
                 <w:rStyle w:val="Hipervnculo"/>
@@ -857,7 +858,7 @@
               <w:rPr>
                 <w:noProof/>
               </w:rPr>
-              <w:instrText xml:space="preserve"> PAGEREF _Toc241941621 \h </w:instrText>
+              <w:instrText xml:space="preserve"> PAGEREF _Toc242457325 \h </w:instrText>
             </w:r>
             <w:r>
               <w:rPr>
@@ -899,7 +900,7 @@
               <w14:ligatures w14:val="standardContextual"/>
             </w:rPr>
           </w:pPr>
-          <w:hyperlink w:anchor="_Toc241941622" w:history="1">
+          <w:hyperlink w:anchor="_Toc242457326" w:history="1">
             <w:r>
               <w:rPr>
                 <w:rStyle w:val="Hipervnculo"/>
@@ -923,7 +924,7 @@
               <w:rPr>
                 <w:noProof/>
               </w:rPr>
-              <w:instrText xml:space="preserve"> PAGEREF _Toc241941622 \h </w:instrText>
+              <w:instrText xml:space="preserve"> PAGEREF _Toc242457326 \h </w:instrText>
             </w:r>
             <w:r>
               <w:rPr>
@@ -965,7 +966,7 @@
               <w14:ligatures w14:val="standardContextual"/>
             </w:rPr>
           </w:pPr>
-          <w:hyperlink w:anchor="_Toc241941623" w:history="1">
+          <w:hyperlink w:anchor="_Toc242457327" w:history="1">
             <w:r>
               <w:rPr>
                 <w:rStyle w:val="Hipervnculo"/>
@@ -989,7 +990,7 @@
               <w:rPr>
                 <w:noProof/>
               </w:rPr>
-              <w:instrText xml:space="preserve"> PAGEREF _Toc241941623 \h </w:instrText>
+              <w:instrText xml:space="preserve"> PAGEREF _Toc242457327 \h </w:instrText>
             </w:r>
             <w:r>
               <w:rPr>
@@ -1031,7 +1032,7 @@
               <w14:ligatures w14:val="standardContextual"/>
             </w:rPr>
           </w:pPr>
-          <w:hyperlink w:anchor="_Toc241941624" w:history="1">
+          <w:hyperlink w:anchor="_Toc242457328" w:history="1">
             <w:r>
               <w:rPr>
                 <w:rStyle w:val="Hipervnculo"/>
@@ -1055,7 +1056,7 @@
               <w:rPr>
                 <w:noProof/>
               </w:rPr>
-              <w:instrText xml:space="preserve"> PAGEREF _Toc241941624 \h </w:instrText>
+              <w:instrText xml:space="preserve"> PAGEREF _Toc242457328 \h </w:instrText>
             </w:r>
             <w:r>
               <w:rPr>
@@ -1097,7 +1098,7 @@
               <w14:ligatures w14:val="standardContextual"/>
             </w:rPr>
           </w:pPr>
-          <w:hyperlink w:anchor="_Toc241941625" w:history="1">
+          <w:hyperlink w:anchor="_Toc242457329" w:history="1">
             <w:r>
               <w:rPr>
                 <w:rStyle w:val="Hipervnculo"/>
@@ -1121,7 +1122,7 @@
               <w:rPr>
                 <w:noProof/>
               </w:rPr>
-              <w:instrText xml:space="preserve"> PAGEREF _Toc241941625 \h </w:instrText>
+              <w:instrText xml:space="preserve"> PAGEREF _Toc242457329 \h </w:instrText>
             </w:r>
             <w:r>
               <w:rPr>
@@ -1163,7 +1164,7 @@
               <w14:ligatures w14:val="standardContextual"/>
             </w:rPr>
           </w:pPr>
-          <w:hyperlink w:anchor="_Toc241941626" w:history="1">
+          <w:hyperlink w:anchor="_Toc242457330" w:history="1">
             <w:r>
               <w:rPr>
                 <w:rStyle w:val="Hipervnculo"/>
@@ -1187,7 +1188,7 @@
               <w:rPr>
                 <w:noProof/>
               </w:rPr>
-              <w:instrText xml:space="preserve"> PAGEREF _Toc241941626 \h </w:instrText>
+              <w:instrText xml:space="preserve"> PAGEREF _Toc242457330 \h </w:instrText>
             </w:r>
             <w:r>
               <w:rPr>
@@ -1229,7 +1230,7 @@
               <w14:ligatures w14:val="standardContextual"/>
             </w:rPr>
           </w:pPr>
-          <w:hyperlink w:anchor="_Toc241941627" w:history="1">
+          <w:hyperlink w:anchor="_Toc242457331" w:history="1">
             <w:r>
               <w:rPr>
                 <w:rStyle w:val="Hipervnculo"/>
@@ -1253,7 +1254,7 @@
               <w:rPr>
                 <w:noProof/>
               </w:rPr>
-              <w:instrText xml:space="preserve"> PAGEREF _Toc241941627 \h </w:instrText>
+              <w:instrText xml:space="preserve"> PAGEREF _Toc242457331 \h </w:instrText>
             </w:r>
             <w:r>
               <w:rPr>
@@ -1295,7 +1296,7 @@
               <w14:ligatures w14:val="standardContextual"/>
             </w:rPr>
           </w:pPr>
-          <w:hyperlink w:anchor="_Toc241941628" w:history="1">
+          <w:hyperlink w:anchor="_Toc242457332" w:history="1">
             <w:r>
               <w:rPr>
                 <w:rStyle w:val="Hipervnculo"/>
@@ -1319,7 +1320,7 @@
               <w:rPr>
                 <w:noProof/>
               </w:rPr>
-              <w:instrText xml:space="preserve"> PAGEREF _Toc241941628 \h </w:instrText>
+              <w:instrText xml:space="preserve"> PAGEREF _Toc242457332 \h </w:instrText>
             </w:r>
             <w:r>
               <w:rPr>
@@ -1361,7 +1362,7 @@
               <w14:ligatures w14:val="standardContextual"/>
             </w:rPr>
           </w:pPr>
-          <w:hyperlink w:anchor="_Toc241941629" w:history="1">
+          <w:hyperlink w:anchor="_Toc242457333" w:history="1">
             <w:r>
               <w:rPr>
                 <w:rStyle w:val="Hipervnculo"/>
@@ -1385,7 +1386,7 @@
               <w:rPr>
                 <w:noProof/>
               </w:rPr>
-              <w:instrText xml:space="preserve"> PAGEREF _Toc241941629 \h </w:instrText>
+              <w:instrText xml:space="preserve"> PAGEREF _Toc242457333 \h </w:instrText>
             </w:r>
             <w:r>
               <w:rPr>
@@ -1427,13 +1428,13 @@
               <w14:ligatures w14:val="standardContextual"/>
             </w:rPr>
           </w:pPr>
-          <w:hyperlink w:anchor="_Toc241941630" w:history="1">
+          <w:hyperlink w:anchor="_Toc242457334" w:history="1">
             <w:r>
               <w:rPr>
                 <w:rStyle w:val="Hipervnculo"/>
                 <w:noProof/>
               </w:rPr>
-              <w:t>7. Cronograma</w:t>
+              <w:t>7. Recursos y responsabilidades</w:t>
             </w:r>
             <w:r>
               <w:rPr>
@@ -1451,7 +1452,7 @@
               <w:rPr>
                 <w:noProof/>
               </w:rPr>
-              <w:instrText xml:space="preserve"> PAGEREF _Toc241941630 \h </w:instrText>
+              <w:instrText xml:space="preserve"> PAGEREF _Toc242457334 \h </w:instrText>
             </w:r>
             <w:r>
               <w:rPr>
@@ -1493,13 +1494,13 @@
               <w14:ligatures w14:val="standardContextual"/>
             </w:rPr>
           </w:pPr>
-          <w:hyperlink w:anchor="_Toc241941631" w:history="1">
+          <w:hyperlink w:anchor="_Toc242457335" w:history="1">
             <w:r>
               <w:rPr>
                 <w:rStyle w:val="Hipervnculo"/>
                 <w:noProof/>
               </w:rPr>
-              <w:t>8. Métricas de prueba</w:t>
+              <w:t>8. Cronograma</w:t>
             </w:r>
             <w:r>
               <w:rPr>
@@ -1517,7 +1518,7 @@
               <w:rPr>
                 <w:noProof/>
               </w:rPr>
-              <w:instrText xml:space="preserve"> PAGEREF _Toc241941631 \h </w:instrText>
+              <w:instrText xml:space="preserve"> PAGEREF _Toc242457335 \h </w:instrText>
             </w:r>
             <w:r>
               <w:rPr>
@@ -1534,7 +1535,7 @@
               <w:rPr>
                 <w:noProof/>
               </w:rPr>
-              <w:t>8</w:t>
+              <w:t>9</w:t>
             </w:r>
             <w:r>
               <w:rPr>
@@ -1559,13 +1560,13 @@
               <w14:ligatures w14:val="standardContextual"/>
             </w:rPr>
           </w:pPr>
-          <w:hyperlink w:anchor="_Toc241941632" w:history="1">
+          <w:hyperlink w:anchor="_Toc242457336" w:history="1">
             <w:r>
               <w:rPr>
                 <w:rStyle w:val="Hipervnculo"/>
                 <w:noProof/>
               </w:rPr>
-              <w:t>9. Riesgos y mitigación</w:t>
+              <w:t>9. Métricas de prueba</w:t>
             </w:r>
             <w:r>
               <w:rPr>
@@ -1583,7 +1584,139 @@
               <w:rPr>
                 <w:noProof/>
               </w:rPr>
-              <w:instrText xml:space="preserve"> PAGEREF _Toc241941632 \h </w:instrText>
+              <w:instrText xml:space="preserve"> PAGEREF _Toc242457336 \h </w:instrText>
+            </w:r>
+            <w:r>
+              <w:rPr>
+                <w:noProof/>
+              </w:rPr>
+            </w:r>
+            <w:r>
+              <w:rPr>
+                <w:noProof/>
+              </w:rPr>
+              <w:fldChar w:fldCharType="separate"/>
+            </w:r>
+            <w:r>
+              <w:rPr>
+                <w:noProof/>
+              </w:rPr>
+              <w:t>9</w:t>
+            </w:r>
+            <w:r>
+              <w:rPr>
+                <w:noProof/>
+              </w:rPr>
+              <w:fldChar w:fldCharType="end"/>
+            </w:r>
+          </w:hyperlink>
+        </w:p>
+        <w:p>
+          <w:pPr>
+            <w:pStyle w:val="TDC2"/>
+            <w:tabs>
+              <w:tab w:val="right" w:leader="dot" w:pos="9628"/>
+            </w:tabs>
+            <w:rPr>
+              <w:rFonts w:asciiTheme="minorHAnsi" w:eastAsiaTheme="minorEastAsia" w:hAnsiTheme="minorHAnsi" w:cstheme="minorBidi"/>
+              <w:noProof/>
+              <w:kern w:val="2"/>
+              <w:sz w:val="24"/>
+              <w:szCs w:val="24"/>
+              <w14:ligatures w14:val="standardContextual"/>
+            </w:rPr>
+          </w:pPr>
+          <w:hyperlink w:anchor="_Toc242457337" w:history="1">
+            <w:r>
+              <w:rPr>
+                <w:rStyle w:val="Hipervnculo"/>
+                <w:noProof/>
+              </w:rPr>
+              <w:t>10. Riesgos y mitigación</w:t>
+            </w:r>
+            <w:r>
+              <w:rPr>
+                <w:noProof/>
+              </w:rPr>
+              <w:tab/>
+            </w:r>
+            <w:r>
+              <w:rPr>
+                <w:noProof/>
+              </w:rPr>
+              <w:fldChar w:fldCharType="begin"/>
+            </w:r>
+            <w:r>
+              <w:rPr>
+                <w:noProof/>
+              </w:rPr>
+              <w:instrText xml:space="preserve"> PAGEREF _Toc242457337 \h </w:instrText>
+            </w:r>
+            <w:r>
+              <w:rPr>
+                <w:noProof/>
+              </w:rPr>
+            </w:r>
+            <w:r>
+              <w:rPr>
+                <w:noProof/>
+              </w:rPr>
+              <w:fldChar w:fldCharType="separate"/>
+            </w:r>
+            <w:r>
+              <w:rPr>
+                <w:noProof/>
+              </w:rPr>
+              <w:t>9</w:t>
+            </w:r>
+            <w:r>
+              <w:rPr>
+                <w:noProof/>
+              </w:rPr>
+              <w:fldChar w:fldCharType="end"/>
+            </w:r>
+          </w:hyperlink>
+        </w:p>
+        <w:p>
+          <w:pPr>
+            <w:pStyle w:val="TDC2"/>
+            <w:tabs>
+              <w:tab w:val="right" w:leader="dot" w:pos="9628"/>
+            </w:tabs>
+            <w:rPr>
+              <w:rFonts w:asciiTheme="minorHAnsi" w:eastAsiaTheme="minorEastAsia" w:hAnsiTheme="minorHAnsi" w:cstheme="minorBidi"/>
+              <w:noProof/>
+              <w:kern w:val="2"/>
+              <w:sz w:val="24"/>
+              <w:szCs w:val="24"/>
+              <w14:ligatures w14:val="standardContextual"/>
+            </w:rPr>
+          </w:pPr>
+          <w:hyperlink w:anchor="_Toc242457338" w:history="1">
+            <w:r>
+              <w:rPr>
+                <w:rStyle w:val="Hipervnculo"/>
+                <w:noProof/>
+              </w:rPr>
+              <w:t>11. Aprobación</w:t>
+            </w:r>
+            <w:r>
+              <w:rPr>
+                <w:noProof/>
+              </w:rPr>
+              <w:tab/>
+            </w:r>
+            <w:r>
+              <w:rPr>
+                <w:noProof/>
+              </w:rPr>
+              <w:fldChar w:fldCharType="begin"/>
+            </w:r>
+            <w:r>
+              <w:rPr>
+                <w:noProof/>
+              </w:rPr>
+              <w:instrText xml:space="preserve"> PAGEREF _Toc242457338 \h </w:instrText>
             </w:r>
             <w:r>
               <w:rPr>
@@ -1625,7 +1758,7 @@
               <w14:ligatures w14:val="standardContextual"/>
             </w:rPr>
           </w:pPr>
-          <w:hyperlink w:anchor="_Toc241941633" w:history="1">
+          <w:hyperlink w:anchor="_Toc242457339" w:history="1">
             <w:r>
               <w:rPr>
                 <w:rStyle w:val="Hipervnculo"/>
@@ -1649,7 +1782,7 @@
               <w:rPr>
                 <w:noProof/>
               </w:rPr>
-              <w:instrText xml:space="preserve"> PAGEREF _Toc241941633 \h </w:instrText>
+              <w:instrText xml:space="preserve"> PAGEREF _Toc242457339 \h </w:instrText>
             </w:r>
             <w:r>
               <w:rPr>
@@ -1691,7 +1824,7 @@
               <w14:ligatures w14:val="standardContextual"/>
             </w:rPr>
           </w:pPr>
-          <w:hyperlink w:anchor="_Toc241941634" w:history="1">
+          <w:hyperlink w:anchor="_Toc242457340" w:history="1">
             <w:r>
               <w:rPr>
                 <w:rStyle w:val="Hipervnculo"/>
@@ -1715,7 +1848,7 @@
               <w:rPr>
                 <w:noProof/>
               </w:rPr>
-              <w:instrText xml:space="preserve"> PAGEREF _Toc241941634 \h </w:instrText>
+              <w:instrText xml:space="preserve"> PAGEREF _Toc242457340 \h </w:instrText>
             </w:r>
             <w:r>
               <w:rPr>
@@ -1757,7 +1890,7 @@
               <w14:ligatures w14:val="standardContextual"/>
             </w:rPr>
           </w:pPr>
-          <w:hyperlink w:anchor="_Toc241941635" w:history="1">
+          <w:hyperlink w:anchor="_Toc242457341" w:history="1">
             <w:r>
               <w:rPr>
                 <w:rStyle w:val="Hipervnculo"/>
@@ -1781,7 +1914,7 @@
               <w:rPr>
                 <w:noProof/>
               </w:rPr>
-              <w:instrText xml:space="preserve"> PAGEREF _Toc241941635 \h </w:instrText>
+              <w:instrText xml:space="preserve"> PAGEREF _Toc242457341 \h </w:instrText>
             </w:r>
             <w:r>
               <w:rPr>
@@ -1823,7 +1956,7 @@
               <w14:ligatures w14:val="standardContextual"/>
             </w:rPr>
           </w:pPr>
-          <w:hyperlink w:anchor="_Toc241941636" w:history="1">
+          <w:hyperlink w:anchor="_Toc242457342" w:history="1">
             <w:r>
               <w:rPr>
                 <w:rStyle w:val="Hipervnculo"/>
@@ -1847,7 +1980,7 @@
               <w:rPr>
                 <w:noProof/>
               </w:rPr>
-              <w:instrText xml:space="preserve"> PAGEREF _Toc241941636 \h </w:instrText>
+              <w:instrText xml:space="preserve"> PAGEREF _Toc242457342 \h </w:instrText>
             </w:r>
             <w:r>
               <w:rPr>
@@ -1890,7 +2023,7 @@
       <w:pPr>
         <w:pStyle w:val="Ttulo1"/>
       </w:pPr>
-      <w:bookmarkStart w:id="0" w:name="_Toc241941611"/>
+      <w:bookmarkStart w:id="0" w:name="_Toc242457315"/>
       <w:r>
         <w:lastRenderedPageBreak/>
         <w:t>Introducción</w:t>
@@ -1902,14 +2035,20 @@
         <w:spacing w:after="100"/>
       </w:pPr>
       <w:r>
-        <w:t>Este documento presenta un esquema breve (avance) de los tres instrumentos de aseguramiento de la calidad para TechStore: el Plan de Calidad (estándares y métricas), el Plan de Pruebas (tipos de pruebas y criterios de aceptación) y las Pruebas de Conformidad (normas y regulaciones que deben cumplirse). Cada parte sigue la estructura de los modelos entregados por el docente y mantiene la trazabilidad con el Informe de Historias de Usuario (HU01–HU30, RF01–RF30, RNF01–RNF09, épicas EP01–EP05).</w:t>
+        <w:t xml:space="preserve">Este documento presenta un </w:t>
+      </w:r>
+      <w:r>
+        <w:t>esquema breve</w:t>
+      </w:r>
+      <w:r>
+        <w:t xml:space="preserve"> de los tres instrumentos de aseguramiento de la calidad para TechStore: el Plan de Calidad (estándares y métricas), el Plan de Pruebas (tipos de pruebas y criterios de aceptación) y las Pruebas de Conformidad (normas y regulaciones que deben cumplirse). Cada parte sigue la estructura de los modelos entregados por el docente y mantiene la trazabilidad con el Informe de Historias de Usuario (HU01–HU30, RF01–RF30, RNF01–RNF09, épicas EP01–EP05).</w:t>
       </w:r>
     </w:p>
     <w:p>
       <w:pPr>
         <w:pStyle w:val="Ttulo2"/>
       </w:pPr>
-      <w:bookmarkStart w:id="1" w:name="_Toc241941612"/>
+      <w:bookmarkStart w:id="1" w:name="_Toc242457316"/>
       <w:r>
         <w:t>Sistema bajo evaluación</w:t>
       </w:r>
@@ -2136,7 +2275,14 @@
                 <w:sz w:val="19"/>
                 <w:szCs w:val="19"/>
               </w:rPr>
-              <w:t>GitHub Pages (también funciona abriendo app/index.html localmente).</w:t>
+              <w:t>GitHub Pages: https://diegoaaron.github.io/calidadProyecto/ (también funciona</w:t>
+            </w:r>
+            <w:r>
+              <w:rPr>
+                <w:sz w:val="19"/>
+                <w:szCs w:val="19"/>
+              </w:rPr>
+              <w:t xml:space="preserve"> abriendo app/index.html localmente).</w:t>
             </w:r>
           </w:p>
         </w:tc>
@@ -2249,9 +2395,8 @@
       <w:pPr>
         <w:pStyle w:val="Ttulo1"/>
       </w:pPr>
-      <w:bookmarkStart w:id="2" w:name="_Toc241941613"/>
+      <w:bookmarkStart w:id="2" w:name="_Toc242457317"/>
       <w:r>
-        <w:lastRenderedPageBreak/>
         <w:t>Parte I. Plan de Calidad</w:t>
       </w:r>
       <w:bookmarkEnd w:id="2"/>
@@ -2260,7 +2405,7 @@
       <w:pPr>
         <w:pStyle w:val="Ttulo2"/>
       </w:pPr>
-      <w:bookmarkStart w:id="3" w:name="_Toc241941614"/>
+      <w:bookmarkStart w:id="3" w:name="_Toc242457318"/>
       <w:r>
         <w:t>1. Objetivos de calidad</w:t>
       </w:r>
@@ -2335,7 +2480,7 @@
       <w:pPr>
         <w:pStyle w:val="Ttulo2"/>
       </w:pPr>
-      <w:bookmarkStart w:id="4" w:name="_Toc241941615"/>
+      <w:bookmarkStart w:id="4" w:name="_Toc242457319"/>
       <w:r>
         <w:t>2. Alcance</w:t>
       </w:r>
@@ -2353,7 +2498,7 @@
       <w:pPr>
         <w:pStyle w:val="Ttulo2"/>
       </w:pPr>
-      <w:bookmarkStart w:id="5" w:name="_Toc241941616"/>
+      <w:bookmarkStart w:id="5" w:name="_Toc242457320"/>
       <w:r>
         <w:t>3. Normas y estándares aplicables</w:t>
       </w:r>
@@ -2786,7 +2931,7 @@
       <w:pPr>
         <w:pStyle w:val="Ttulo2"/>
       </w:pPr>
-      <w:bookmarkStart w:id="6" w:name="_Toc241941617"/>
+      <w:bookmarkStart w:id="6" w:name="_Toc242457321"/>
       <w:r>
         <w:t>4. Roles y responsabilidades</w:t>
       </w:r>
@@ -3195,7 +3340,7 @@
       <w:pPr>
         <w:pStyle w:val="Ttulo2"/>
       </w:pPr>
-      <w:bookmarkStart w:id="7" w:name="_Toc241941618"/>
+      <w:bookmarkStart w:id="7" w:name="_Toc242457322"/>
       <w:r>
         <w:t>5. Métricas de calidad</w:t>
       </w:r>
@@ -3259,7 +3404,6 @@
                 <w:sz w:val="19"/>
                 <w:szCs w:val="19"/>
               </w:rPr>
-              <w:lastRenderedPageBreak/>
               <w:t>Característica (ISO 25010)</w:t>
             </w:r>
           </w:p>
@@ -4564,7 +4708,7 @@
                 <w:sz w:val="19"/>
                 <w:szCs w:val="19"/>
               </w:rPr>
-              <w:t>Páginas correctas a 375 px ÷ 12 páginas</w:t>
+              <w:t>Páginas correctas a 375 px ÷ 11 páginas</w:t>
             </w:r>
           </w:p>
         </w:tc>
@@ -4695,7 +4839,7 @@
       <w:pPr>
         <w:pStyle w:val="Ttulo2"/>
       </w:pPr>
-      <w:bookmarkStart w:id="8" w:name="_Toc241941619"/>
+      <w:bookmarkStart w:id="8" w:name="_Toc242457323"/>
       <w:r>
         <w:t>6. Estrategias de aseguramiento</w:t>
       </w:r>
@@ -4785,7 +4929,7 @@
       <w:pPr>
         <w:pStyle w:val="Ttulo2"/>
       </w:pPr>
-      <w:bookmarkStart w:id="9" w:name="_Toc241941620"/>
+      <w:bookmarkStart w:id="9" w:name="_Toc242457324"/>
       <w:r>
         <w:t>7. Plan de revisión y auditoría</w:t>
       </w:r>
@@ -4834,7 +4978,7 @@
       <w:pPr>
         <w:pStyle w:val="Ttulo2"/>
       </w:pPr>
-      <w:bookmarkStart w:id="10" w:name="_Toc241941621"/>
+      <w:bookmarkStart w:id="10" w:name="_Toc242457325"/>
       <w:r>
         <w:t>8. Herramientas de apoyo</w:t>
       </w:r>
@@ -4989,7 +5133,6 @@
                 <w:sz w:val="19"/>
                 <w:szCs w:val="19"/>
               </w:rPr>
-              <w:lastRenderedPageBreak/>
               <w:t>Rendimiento, accesibilidad, responsive</w:t>
             </w:r>
           </w:p>
@@ -5174,7 +5317,7 @@
       <w:pPr>
         <w:pStyle w:val="Ttulo2"/>
       </w:pPr>
-      <w:bookmarkStart w:id="11" w:name="_Toc241941622"/>
+      <w:bookmarkStart w:id="11" w:name="_Toc242457326"/>
       <w:r>
         <w:t>9. Criterios de aceptación del producto</w:t>
       </w:r>
@@ -5233,6 +5376,19 @@
       </w:r>
     </w:p>
     <w:p>
+      <w:pPr>
+        <w:pStyle w:val="Prrafodelista"/>
+        <w:numPr>
+          <w:ilvl w:val="0"/>
+          <w:numId w:val="2"/>
+        </w:numPr>
+        <w:spacing w:after="60"/>
+      </w:pPr>
+      <w:r>
+        <w:t>Pruebas de aceptación de usuario (UAT) aprobadas en Maze: tasa de éxito ≥ 80 % y SUS ≥ 68.</w:t>
+      </w:r>
+    </w:p>
+    <w:p>
       <w:r>
         <w:br w:type="page"/>
       </w:r>
@@ -5241,9 +5397,8 @@
       <w:pPr>
         <w:pStyle w:val="Ttulo1"/>
       </w:pPr>
-      <w:bookmarkStart w:id="12" w:name="_Toc241941623"/>
+      <w:bookmarkStart w:id="12" w:name="_Toc242457327"/>
       <w:r>
-        <w:lastRenderedPageBreak/>
         <w:t>Parte II. Plan de Pruebas</w:t>
       </w:r>
       <w:bookmarkEnd w:id="12"/>
@@ -5252,7 +5407,7 @@
       <w:pPr>
         <w:pStyle w:val="Ttulo2"/>
       </w:pPr>
-      <w:bookmarkStart w:id="13" w:name="_Toc241941624"/>
+      <w:bookmarkStart w:id="13" w:name="_Toc242457328"/>
       <w:r>
         <w:t>1. Alcance</w:t>
       </w:r>
@@ -5292,7 +5447,7 @@
       <w:pPr>
         <w:pStyle w:val="Ttulo2"/>
       </w:pPr>
-      <w:bookmarkStart w:id="14" w:name="_Toc241941625"/>
+      <w:bookmarkStart w:id="14" w:name="_Toc242457329"/>
       <w:r>
         <w:t>2. Objetivos</w:t>
       </w:r>
@@ -5341,7 +5496,7 @@
       <w:pPr>
         <w:pStyle w:val="Ttulo2"/>
       </w:pPr>
-      <w:bookmarkStart w:id="15" w:name="_Toc241941626"/>
+      <w:bookmarkStart w:id="15" w:name="_Toc242457330"/>
       <w:r>
         <w:t>3. Estrategia por niveles</w:t>
       </w:r>
@@ -5872,7 +6027,7 @@
       <w:pPr>
         <w:pStyle w:val="Ttulo2"/>
       </w:pPr>
-      <w:bookmarkStart w:id="16" w:name="_Toc241941627"/>
+      <w:bookmarkStart w:id="16" w:name="_Toc242457331"/>
       <w:r>
         <w:t>4. Tipos de pruebas</w:t>
       </w:r>
@@ -6881,7 +7036,7 @@
       <w:pPr>
         <w:pStyle w:val="Ttulo2"/>
       </w:pPr>
-      <w:bookmarkStart w:id="17" w:name="_Toc241941628"/>
+      <w:bookmarkStart w:id="17" w:name="_Toc242457332"/>
       <w:r>
         <w:t>5. Criterios de entrada, salida y suspensión</w:t>
       </w:r>
@@ -6935,7 +7090,6 @@
                 <w:sz w:val="19"/>
                 <w:szCs w:val="19"/>
               </w:rPr>
-              <w:lastRenderedPageBreak/>
               <w:t>Criterio</w:t>
             </w:r>
           </w:p>
@@ -7119,7 +7273,7 @@
       <w:pPr>
         <w:pStyle w:val="Ttulo2"/>
       </w:pPr>
-      <w:bookmarkStart w:id="18" w:name="_Toc241941629"/>
+      <w:bookmarkStart w:id="18" w:name="_Toc242457333"/>
       <w:r>
         <w:t>6. Criterios de aceptación (casos de prueba representativos)</w:t>
       </w:r>
@@ -8426,11 +8580,449 @@
       <w:pPr>
         <w:pStyle w:val="Ttulo2"/>
       </w:pPr>
-      <w:bookmarkStart w:id="19" w:name="_Toc241941630"/>
+      <w:bookmarkStart w:id="19" w:name="_Toc242457334"/>
       <w:r>
-        <w:t>7. Cronograma</w:t>
+        <w:t>7. Recursos y responsabilidades</w:t>
       </w:r>
       <w:bookmarkEnd w:id="19"/>
+    </w:p>
+    <w:tbl>
+      <w:tblPr>
+        <w:tblW w:w="9638" w:type="dxa"/>
+        <w:tblBorders>
+          <w:top w:val="single" w:sz="4" w:space="0" w:color="auto"/>
+          <w:left w:val="single" w:sz="4" w:space="0" w:color="auto"/>
+          <w:bottom w:val="single" w:sz="4" w:space="0" w:color="auto"/>
+          <w:right w:val="single" w:sz="4" w:space="0" w:color="auto"/>
+          <w:insideH w:val="single" w:sz="4" w:space="0" w:color="auto"/>
+          <w:insideV w:val="single" w:sz="4" w:space="0" w:color="auto"/>
+        </w:tblBorders>
+        <w:tblCellMar>
+          <w:left w:w="10" w:type="dxa"/>
+          <w:right w:w="10" w:type="dxa"/>
+        </w:tblCellMar>
+        <w:tblLook w:val="0000" w:firstRow="0" w:lastRow="0" w:firstColumn="0" w:lastColumn="0" w:noHBand="0" w:noVBand="0"/>
+      </w:tblPr>
+      <w:tblGrid>
+        <w:gridCol w:w="2600"/>
+        <w:gridCol w:w="7038"/>
+      </w:tblGrid>
+      <w:tr>
+        <w:trPr>
+          <w:tblHeader/>
+        </w:trPr>
+        <w:tc>
+          <w:tcPr>
+            <w:tcW w:w="2600" w:type="dxa"/>
+            <w:shd w:val="clear" w:color="auto" w:fill="1F4E79"/>
+            <w:tcMar>
+              <w:top w:w="60" w:type="dxa"/>
+              <w:left w:w="100" w:type="dxa"/>
+              <w:bottom w:w="60" w:type="dxa"/>
+              <w:right w:w="100" w:type="dxa"/>
+            </w:tcMar>
+          </w:tcPr>
+          <w:p>
+            <w:pPr>
+              <w:spacing w:after="40"/>
+            </w:pPr>
+            <w:r>
+              <w:rPr>
+                <w:b/>
+                <w:bCs/>
+                <w:color w:val="FFFFFF"/>
+                <w:sz w:val="19"/>
+                <w:szCs w:val="19"/>
+              </w:rPr>
+              <w:t>Rol / recurso</w:t>
+            </w:r>
+          </w:p>
+        </w:tc>
+        <w:tc>
+          <w:tcPr>
+            <w:tcW w:w="7038" w:type="dxa"/>
+            <w:shd w:val="clear" w:color="auto" w:fill="1F4E79"/>
+            <w:tcMar>
+              <w:top w:w="60" w:type="dxa"/>
+              <w:left w:w="100" w:type="dxa"/>
+              <w:bottom w:w="60" w:type="dxa"/>
+              <w:right w:w="100" w:type="dxa"/>
+            </w:tcMar>
+          </w:tcPr>
+          <w:p>
+            <w:pPr>
+              <w:spacing w:after="40"/>
+            </w:pPr>
+            <w:r>
+              <w:rPr>
+                <w:b/>
+                <w:bCs/>
+                <w:color w:val="FFFFFF"/>
+                <w:sz w:val="19"/>
+                <w:szCs w:val="19"/>
+              </w:rPr>
+              <w:t>Responsabilidad</w:t>
+            </w:r>
+          </w:p>
+        </w:tc>
+      </w:tr>
+      <w:tr>
+        <w:tc>
+          <w:tcPr>
+            <w:tcW w:w="2600" w:type="dxa"/>
+            <w:tcMar>
+              <w:top w:w="60" w:type="dxa"/>
+              <w:left w:w="100" w:type="dxa"/>
+              <w:bottom w:w="60" w:type="dxa"/>
+              <w:right w:w="100" w:type="dxa"/>
+            </w:tcMar>
+          </w:tcPr>
+          <w:p>
+            <w:pPr>
+              <w:spacing w:after="40"/>
+            </w:pPr>
+            <w:r>
+              <w:rPr>
+                <w:sz w:val="19"/>
+                <w:szCs w:val="19"/>
+              </w:rPr>
+              <w:t>Líder de QA</w:t>
+            </w:r>
+          </w:p>
+        </w:tc>
+        <w:tc>
+          <w:tcPr>
+            <w:tcW w:w="7038" w:type="dxa"/>
+            <w:tcMar>
+              <w:top w:w="60" w:type="dxa"/>
+              <w:left w:w="100" w:type="dxa"/>
+              <w:bottom w:w="60" w:type="dxa"/>
+              <w:right w:w="100" w:type="dxa"/>
+            </w:tcMar>
+          </w:tcPr>
+          <w:p>
+            <w:pPr>
+              <w:spacing w:after="40"/>
+            </w:pPr>
+            <w:r>
+              <w:rPr>
+                <w:sz w:val="19"/>
+                <w:szCs w:val="19"/>
+              </w:rPr>
+              <w:t>Coordina el plan, prioriza los casos de prueba y aprueba el informe de pruebas.</w:t>
+            </w:r>
+          </w:p>
+        </w:tc>
+      </w:tr>
+      <w:tr>
+        <w:tc>
+          <w:tcPr>
+            <w:tcW w:w="2600" w:type="dxa"/>
+            <w:shd w:val="clear" w:color="auto" w:fill="F5F8FC"/>
+            <w:tcMar>
+              <w:top w:w="60" w:type="dxa"/>
+              <w:left w:w="100" w:type="dxa"/>
+              <w:bottom w:w="60" w:type="dxa"/>
+              <w:right w:w="100" w:type="dxa"/>
+            </w:tcMar>
+          </w:tcPr>
+          <w:p>
+            <w:pPr>
+              <w:spacing w:after="40"/>
+            </w:pPr>
+            <w:r>
+              <w:rPr>
+                <w:sz w:val="19"/>
+                <w:szCs w:val="19"/>
+              </w:rPr>
+              <w:t>Desarrollador</w:t>
+            </w:r>
+          </w:p>
+        </w:tc>
+        <w:tc>
+          <w:tcPr>
+            <w:tcW w:w="7038" w:type="dxa"/>
+            <w:shd w:val="clear" w:color="auto" w:fill="F5F8FC"/>
+            <w:tcMar>
+              <w:top w:w="60" w:type="dxa"/>
+              <w:left w:w="100" w:type="dxa"/>
+              <w:bottom w:w="60" w:type="dxa"/>
+              <w:right w:w="100" w:type="dxa"/>
+            </w:tcMar>
+          </w:tcPr>
+          <w:p>
+            <w:pPr>
+              <w:spacing w:after="40"/>
+            </w:pPr>
+            <w:r>
+              <w:rPr>
+                <w:sz w:val="19"/>
+                <w:szCs w:val="19"/>
+              </w:rPr>
+              <w:t>Escribe y mantiene las pruebas unitarias en tests.html y corrige los defectos reportados.</w:t>
+            </w:r>
+          </w:p>
+        </w:tc>
+      </w:tr>
+      <w:tr>
+        <w:tc>
+          <w:tcPr>
+            <w:tcW w:w="2600" w:type="dxa"/>
+            <w:tcMar>
+              <w:top w:w="60" w:type="dxa"/>
+              <w:left w:w="100" w:type="dxa"/>
+              <w:bottom w:w="60" w:type="dxa"/>
+              <w:right w:w="100" w:type="dxa"/>
+            </w:tcMar>
+          </w:tcPr>
+          <w:p>
+            <w:pPr>
+              <w:spacing w:after="40"/>
+            </w:pPr>
+            <w:r>
+              <w:rPr>
+                <w:sz w:val="19"/>
+                <w:szCs w:val="19"/>
+              </w:rPr>
+              <w:t>Analista de QA (equipo de pruebas)</w:t>
+            </w:r>
+          </w:p>
+        </w:tc>
+        <w:tc>
+          <w:tcPr>
+            <w:tcW w:w="7038" w:type="dxa"/>
+            <w:tcMar>
+              <w:top w:w="60" w:type="dxa"/>
+              <w:left w:w="100" w:type="dxa"/>
+              <w:bottom w:w="60" w:type="dxa"/>
+              <w:right w:w="100" w:type="dxa"/>
+            </w:tcMar>
+          </w:tcPr>
+          <w:p>
+            <w:pPr>
+              <w:spacing w:after="40"/>
+            </w:pPr>
+            <w:r>
+              <w:rPr>
+                <w:sz w:val="19"/>
+                <w:szCs w:val="19"/>
+              </w:rPr>
+              <w:t>Diseña y ejecuta los casos de prueba y de conformidad, registra defectos con evidencia.</w:t>
+            </w:r>
+          </w:p>
+        </w:tc>
+      </w:tr>
+      <w:tr>
+        <w:tc>
+          <w:tcPr>
+            <w:tcW w:w="2600" w:type="dxa"/>
+            <w:shd w:val="clear" w:color="auto" w:fill="F5F8FC"/>
+            <w:tcMar>
+              <w:top w:w="60" w:type="dxa"/>
+              <w:left w:w="100" w:type="dxa"/>
+              <w:bottom w:w="60" w:type="dxa"/>
+              <w:right w:w="100" w:type="dxa"/>
+            </w:tcMar>
+          </w:tcPr>
+          <w:p>
+            <w:pPr>
+              <w:spacing w:after="40"/>
+            </w:pPr>
+            <w:r>
+              <w:rPr>
+                <w:sz w:val="19"/>
+                <w:szCs w:val="19"/>
+              </w:rPr>
+              <w:t>Usuarios clave</w:t>
+            </w:r>
+          </w:p>
+        </w:tc>
+        <w:tc>
+          <w:tcPr>
+            <w:tcW w:w="7038" w:type="dxa"/>
+            <w:shd w:val="clear" w:color="auto" w:fill="F5F8FC"/>
+            <w:tcMar>
+              <w:top w:w="60" w:type="dxa"/>
+              <w:left w:w="100" w:type="dxa"/>
+              <w:bottom w:w="60" w:type="dxa"/>
+              <w:right w:w="100" w:type="dxa"/>
+            </w:tcMar>
+          </w:tcPr>
+          <w:p>
+            <w:pPr>
+              <w:spacing w:after="40"/>
+            </w:pPr>
+            <w:r>
+              <w:rPr>
+                <w:sz w:val="19"/>
+                <w:szCs w:val="19"/>
+              </w:rPr>
+              <w:t>Compañeros de curso y docente: ejecutan las tareas de usabilidad en Maze y validan la aceptación (UAT).</w:t>
+            </w:r>
+          </w:p>
+        </w:tc>
+      </w:tr>
+      <w:tr>
+        <w:tc>
+          <w:tcPr>
+            <w:tcW w:w="2600" w:type="dxa"/>
+            <w:tcMar>
+              <w:top w:w="60" w:type="dxa"/>
+              <w:left w:w="100" w:type="dxa"/>
+              <w:bottom w:w="60" w:type="dxa"/>
+              <w:right w:w="100" w:type="dxa"/>
+            </w:tcMar>
+          </w:tcPr>
+          <w:p>
+            <w:pPr>
+              <w:spacing w:after="40"/>
+            </w:pPr>
+            <w:r>
+              <w:rPr>
+                <w:sz w:val="19"/>
+                <w:szCs w:val="19"/>
+              </w:rPr>
+              <w:t>Entorno</w:t>
+            </w:r>
+          </w:p>
+        </w:tc>
+        <w:tc>
+          <w:tcPr>
+            <w:tcW w:w="7038" w:type="dxa"/>
+            <w:tcMar>
+              <w:top w:w="60" w:type="dxa"/>
+              <w:left w:w="100" w:type="dxa"/>
+              <w:bottom w:w="60" w:type="dxa"/>
+              <w:right w:w="100" w:type="dxa"/>
+            </w:tcMar>
+          </w:tcPr>
+          <w:p>
+            <w:pPr>
+              <w:spacing w:after="40"/>
+            </w:pPr>
+            <w:r>
+              <w:rPr>
+                <w:sz w:val="19"/>
+                <w:szCs w:val="19"/>
+              </w:rPr>
+              <w:t>Aplicación publicada en GitHub Pages; Chrome, Edge y Firefox en escritorio; vista móvil de 375 px con DevTools.</w:t>
+            </w:r>
+          </w:p>
+        </w:tc>
+      </w:tr>
+      <w:tr>
+        <w:tc>
+          <w:tcPr>
+            <w:tcW w:w="2600" w:type="dxa"/>
+            <w:shd w:val="clear" w:color="auto" w:fill="F5F8FC"/>
+            <w:tcMar>
+              <w:top w:w="60" w:type="dxa"/>
+              <w:left w:w="100" w:type="dxa"/>
+              <w:bottom w:w="60" w:type="dxa"/>
+              <w:right w:w="100" w:type="dxa"/>
+            </w:tcMar>
+          </w:tcPr>
+          <w:p>
+            <w:pPr>
+              <w:spacing w:after="40"/>
+            </w:pPr>
+            <w:r>
+              <w:rPr>
+                <w:sz w:val="19"/>
+                <w:szCs w:val="19"/>
+              </w:rPr>
+              <w:t>Herramientas</w:t>
+            </w:r>
+          </w:p>
+        </w:tc>
+        <w:tc>
+          <w:tcPr>
+            <w:tcW w:w="7038" w:type="dxa"/>
+            <w:shd w:val="clear" w:color="auto" w:fill="F5F8FC"/>
+            <w:tcMar>
+              <w:top w:w="60" w:type="dxa"/>
+              <w:left w:w="100" w:type="dxa"/>
+              <w:bottom w:w="60" w:type="dxa"/>
+              <w:right w:w="100" w:type="dxa"/>
+            </w:tcMar>
+          </w:tcPr>
+          <w:p>
+            <w:pPr>
+              <w:spacing w:after="40"/>
+            </w:pPr>
+            <w:r>
+              <w:rPr>
+                <w:sz w:val="19"/>
+                <w:szCs w:val="19"/>
+              </w:rPr>
+              <w:t>tests.html (unitarias), Chrome DevTools y Lighthouse (rendimiento, accesibilidad, responsive), Maze (usabilidad), GitHub Issues (defectos).</w:t>
+            </w:r>
+          </w:p>
+        </w:tc>
+      </w:tr>
+      <w:tr>
+        <w:tc>
+          <w:tcPr>
+            <w:tcW w:w="2600" w:type="dxa"/>
+            <w:tcMar>
+              <w:top w:w="60" w:type="dxa"/>
+              <w:left w:w="100" w:type="dxa"/>
+              <w:bottom w:w="60" w:type="dxa"/>
+              <w:right w:w="100" w:type="dxa"/>
+            </w:tcMar>
+          </w:tcPr>
+          <w:p>
+            <w:pPr>
+              <w:spacing w:after="40"/>
+            </w:pPr>
+            <w:r>
+              <w:rPr>
+                <w:sz w:val="19"/>
+                <w:szCs w:val="19"/>
+              </w:rPr>
+              <w:t>Datos de prueba</w:t>
+            </w:r>
+          </w:p>
+        </w:tc>
+        <w:tc>
+          <w:tcPr>
+            <w:tcW w:w="7038" w:type="dxa"/>
+            <w:tcMar>
+              <w:top w:w="60" w:type="dxa"/>
+              <w:left w:w="100" w:type="dxa"/>
+              <w:bottom w:w="60" w:type="dxa"/>
+              <w:right w:w="100" w:type="dxa"/>
+            </w:tcMar>
+          </w:tcPr>
+          <w:p>
+            <w:pPr>
+              <w:spacing w:after="40"/>
+            </w:pPr>
+            <w:r>
+              <w:rPr>
+                <w:sz w:val="19"/>
+                <w:szCs w:val="19"/>
+              </w:rPr>
+              <w:t>Usuario demo@techstore.pe / Demo@1234, tarjeta 4111 1111 1111 1111 y opción de restablecer los datos de demo.</w:t>
+            </w:r>
+          </w:p>
+        </w:tc>
+      </w:tr>
+    </w:tbl>
+    <w:p>
+      <w:pPr>
+        <w:spacing w:after="100"/>
+      </w:pPr>
+    </w:p>
+    <w:p>
+      <w:pPr>
+        <w:pStyle w:val="Ttulo2"/>
+      </w:pPr>
+      <w:bookmarkStart w:id="20" w:name="_Toc242457335"/>
+      <w:r>
+        <w:t>8. Cronograma</w:t>
+      </w:r>
+      <w:bookmarkEnd w:id="20"/>
     </w:p>
     <w:tbl>
       <w:tblPr>
@@ -8906,11 +9498,11 @@
       <w:pPr>
         <w:pStyle w:val="Ttulo2"/>
       </w:pPr>
-      <w:bookmarkStart w:id="20" w:name="_Toc241941631"/>
+      <w:bookmarkStart w:id="21" w:name="_Toc242457336"/>
       <w:r>
-        <w:t>8. Métricas de prueba</w:t>
+        <w:t>9. Métricas de prueba</w:t>
       </w:r>
-      <w:bookmarkEnd w:id="20"/>
+      <w:bookmarkEnd w:id="21"/>
     </w:p>
     <w:p>
       <w:pPr>
@@ -8922,7 +9514,6 @@
         <w:spacing w:after="60"/>
       </w:pPr>
       <w:r>
-        <w:lastRenderedPageBreak/>
         <w:t>Casos ejecutados ÷ casos diseñados: ≥ 95 %.</w:t>
       </w:r>
     </w:p>
@@ -8969,11 +9560,11 @@
       <w:pPr>
         <w:pStyle w:val="Ttulo2"/>
       </w:pPr>
-      <w:bookmarkStart w:id="21" w:name="_Toc241941632"/>
+      <w:bookmarkStart w:id="22" w:name="_Toc242457337"/>
       <w:r>
-        <w:t>9. Riesgos y mitigación</w:t>
+        <w:t>10. Riesgos y mitigación</w:t>
       </w:r>
-      <w:bookmarkEnd w:id="21"/>
+      <w:bookmarkEnd w:id="22"/>
     </w:p>
     <w:tbl>
       <w:tblPr>
@@ -9253,6 +9844,81 @@
       </w:tr>
     </w:tbl>
     <w:p>
+      <w:pPr>
+        <w:spacing w:after="100"/>
+      </w:pPr>
+    </w:p>
+    <w:p>
+      <w:pPr>
+        <w:pStyle w:val="Ttulo2"/>
+      </w:pPr>
+      <w:bookmarkStart w:id="23" w:name="_Toc242457338"/>
+      <w:r>
+        <w:t>11. Aprobación</w:t>
+      </w:r>
+      <w:bookmarkEnd w:id="23"/>
+    </w:p>
+    <w:p>
+      <w:pPr>
+        <w:spacing w:after="100"/>
+      </w:pPr>
+      <w:r>
+        <w:t>El software se considera aprobado para su entrega si cumple todas las condiciones siguientes:</w:t>
+      </w:r>
+    </w:p>
+    <w:p>
+      <w:pPr>
+        <w:pStyle w:val="Prrafodelista"/>
+        <w:numPr>
+          <w:ilvl w:val="0"/>
+          <w:numId w:val="2"/>
+        </w:numPr>
+        <w:spacing w:after="60"/>
+      </w:pPr>
+      <w:r>
+        <w:t>Se alcanzaron los criterios de salida de la sección 5.</w:t>
+      </w:r>
+    </w:p>
+    <w:p>
+      <w:pPr>
+        <w:pStyle w:val="Prrafodelista"/>
+        <w:numPr>
+          <w:ilvl w:val="0"/>
+          <w:numId w:val="2"/>
+        </w:numPr>
+        <w:spacing w:after="60"/>
+      </w:pPr>
+      <w:r>
+        <w:t>Los defectos críticos y altos fueron corregidos y verificados con pruebas de regresión.</w:t>
+      </w:r>
+    </w:p>
+    <w:p>
+      <w:pPr>
+        <w:pStyle w:val="Prrafodelista"/>
+        <w:numPr>
+          <w:ilvl w:val="0"/>
+          <w:numId w:val="2"/>
+        </w:numPr>
+        <w:spacing w:after="60"/>
+      </w:pPr>
+      <w:r>
+        <w:t>Los usuarios clave validaron la aceptación (UAT) en Maze: tasa de éxito de tareas ≥ 80 % y SUS ≥ 68.</w:t>
+      </w:r>
+    </w:p>
+    <w:p>
+      <w:pPr>
+        <w:pStyle w:val="Prrafodelista"/>
+        <w:numPr>
+          <w:ilvl w:val="0"/>
+          <w:numId w:val="2"/>
+        </w:numPr>
+        <w:spacing w:after="60"/>
+      </w:pPr>
+      <w:r>
+        <w:t>El Líder de QA y el docente revisaron y firmaron el informe de pruebas.</w:t>
+      </w:r>
+    </w:p>
+    <w:p>
       <w:r>
         <w:br w:type="page"/>
       </w:r>
@@ -9261,12 +9927,11 @@
       <w:pPr>
         <w:pStyle w:val="Ttulo1"/>
       </w:pPr>
-      <w:bookmarkStart w:id="22" w:name="_Toc241941633"/>
+      <w:bookmarkStart w:id="24" w:name="_Toc242457339"/>
       <w:r>
-        <w:lastRenderedPageBreak/>
         <w:t>Parte III. Pruebas de Conformidad</w:t>
       </w:r>
-      <w:bookmarkEnd w:id="22"/>
+      <w:bookmarkEnd w:id="24"/>
     </w:p>
     <w:p>
       <w:pPr>
@@ -9297,11 +9962,11 @@
       <w:pPr>
         <w:pStyle w:val="Ttulo2"/>
       </w:pPr>
-      <w:bookmarkStart w:id="23" w:name="_Toc241941634"/>
+      <w:bookmarkStart w:id="25" w:name="_Toc242457340"/>
       <w:r>
         <w:t>1. Normas y regulaciones que deben cumplirse</w:t>
       </w:r>
-      <w:bookmarkEnd w:id="23"/>
+      <w:bookmarkEnd w:id="25"/>
     </w:p>
     <w:tbl>
       <w:tblPr>
@@ -10025,11 +10690,11 @@
       <w:pPr>
         <w:pStyle w:val="Ttulo2"/>
       </w:pPr>
-      <w:bookmarkStart w:id="24" w:name="_Toc241941635"/>
+      <w:bookmarkStart w:id="26" w:name="_Toc242457341"/>
       <w:r>
         <w:t>2. Casos de conformidad</w:t>
       </w:r>
-      <w:bookmarkEnd w:id="24"/>
+      <w:bookmarkEnd w:id="26"/>
     </w:p>
     <w:p>
       <w:pPr>
@@ -10617,7 +11282,6 @@
                 <w:sz w:val="19"/>
                 <w:szCs w:val="19"/>
               </w:rPr>
-              <w:lastRenderedPageBreak/>
               <w:t>Resultado esperado</w:t>
             </w:r>
           </w:p>
@@ -10969,7 +11633,7 @@
                 <w:sz w:val="19"/>
                 <w:szCs w:val="19"/>
               </w:rPr>
-              <w:t>El sistema cierra la sesión y pide volver a iniciarla («Tu sesión ha expirado. Inicia sesión nuevamente.»).</w:t>
+              <w:t>El sistema cierra la sesión y pide volver a iniciarla («Tu sesión se cerró por inactividad (15 minutos). Vuelve a iniciar sesión.»).</w:t>
             </w:r>
           </w:p>
         </w:tc>
@@ -11895,7 +12559,6 @@
                 <w:sz w:val="19"/>
                 <w:szCs w:val="19"/>
               </w:rPr>
-              <w:lastRenderedPageBreak/>
               <w:t>Criterio de conformidad</w:t>
             </w:r>
           </w:p>
@@ -12177,11 +12840,11 @@
       <w:pPr>
         <w:pStyle w:val="Ttulo2"/>
       </w:pPr>
-      <w:bookmarkStart w:id="25" w:name="_Toc241941636"/>
+      <w:bookmarkStart w:id="27" w:name="_Toc242457342"/>
       <w:r>
         <w:t>3. Matriz de resultados de conformidad</w:t>
       </w:r>
-      <w:bookmarkEnd w:id="25"/>
+      <w:bookmarkEnd w:id="27"/>
     </w:p>
     <w:tbl>
       <w:tblPr>
@@ -13147,10 +13810,10 @@
           <w:b/>
           <w:bCs/>
         </w:rPr>
-        <w:t xml:space="preserve">Próximos pasos del avance: </w:t>
+        <w:t xml:space="preserve">Próximos pasos: </w:t>
       </w:r>
       <w:r>
-        <w:t>ejecutar los casos de conformidad y de prueba, registrar resultados y evidencias (capturas), completar la prueba de usabilidad en Maze y consolidar las métricas en el informe final.</w:t>
+        <w:t>este esquema sirve de base para los entregables completos del Plan de Calidad, el Plan de Pruebas y la Prueba de Conformidad, donde se ejecutarán los casos, se registrarán los resultados y evidencias (capturas), se completará la prueba de usabilidad en Maze y se consolidarán las métricas en el informe final.</w:t>
       </w:r>
     </w:p>
     <w:sectPr>

</xml_diff>

<commit_message>
Carátula UTP en los documentos y presentación resumida de los tres planes
- Carátula de docs/caratula.docx aplicada a los 5 documentos Word (título adaptado).
- Portada de la presentación del esquema con logo y datos del curso.
- Nueva presentación de 20 diapositivas: Plan de Pruebas, Plan de Calidad
  y Prueba de Conformidad, con notas del orador.

Co-Authored-By: Claude Opus 5.5 <noreply@anthropic.com>
</commit_message>
<xml_diff>
--- a/docs/Esquema_Calidad_Pruebas_Conformidad.docx
+++ b/docs/Esquema_Calidad_Pruebas_Conformidad.docx
@@ -4,129 +4,284 @@
   <w:body>
     <w:p>
       <w:pPr>
-        <w:spacing w:before="1600" w:after="200"/>
+        <w:spacing w:after="240"/>
         <w:jc w:val="center"/>
+        <w:rPr>
+          <w:rFonts w:ascii="Arial" w:hAnsi="Arial" w:cs="Arial"/>
+        </w:rPr>
       </w:pPr>
       <w:r>
         <w:rPr>
-          <w:b/>
-          <w:bCs/>
-          <w:sz w:val="28"/>
-          <w:szCs w:val="28"/>
+          <w:rFonts w:ascii="Arial" w:hAnsi="Arial" w:cs="Arial"/>
+          <w:noProof/>
         </w:rPr>
-        <w:t>[Nombre de la universidad]</w:t>
+        <w:drawing>
+          <wp:inline distT="0" distB="0" distL="0" distR="0" wp14:anchorId="194418BA" wp14:editId="64756951">
+            <wp:extent cx="2247900" cy="600075"/>
+            <wp:effectExtent l="0" t="0" r="0" b="0"/>
+            <wp:docPr id="1" name="utp" descr="Logotipo de la Universidad Tecnológica del Perú" title="UTP"/>
+            <wp:cNvGraphicFramePr>
+              <a:graphicFrameLocks xmlns:a="http://schemas.openxmlformats.org/drawingml/2006/main" noChangeAspect="1"/>
+            </wp:cNvGraphicFramePr>
+            <a:graphic xmlns:a="http://schemas.openxmlformats.org/drawingml/2006/main">
+              <a:graphicData uri="http://schemas.openxmlformats.org/drawingml/2006/picture">
+                <pic:pic xmlns:pic="http://schemas.openxmlformats.org/drawingml/2006/picture">
+                  <pic:nvPicPr>
+                    <pic:cNvPr id="0" name=""/>
+                    <pic:cNvPicPr>
+                      <a:picLocks noChangeAspect="1" noChangeArrowheads="1"/>
+                    </pic:cNvPicPr>
+                  </pic:nvPicPr>
+                  <pic:blipFill>
+                    <a:blip r:embed="rId7"/>
+                    <a:srcRect/>
+                    <a:stretch>
+                      <a:fillRect/>
+                    </a:stretch>
+                  </pic:blipFill>
+                  <pic:spPr bwMode="auto">
+                    <a:xfrm>
+                      <a:off x="0" y="0"/>
+                      <a:ext cx="2247900" cy="600075"/>
+                    </a:xfrm>
+                    <a:prstGeom prst="rect">
+                      <a:avLst/>
+                    </a:prstGeom>
+                  </pic:spPr>
+                </pic:pic>
+              </a:graphicData>
+            </a:graphic>
+          </wp:inline>
+        </w:drawing>
       </w:r>
     </w:p>
     <w:p>
       <w:pPr>
-        <w:spacing w:after="1200"/>
+        <w:spacing w:after="120"/>
         <w:jc w:val="center"/>
+        <w:rPr>
+          <w:rFonts w:ascii="Arial" w:hAnsi="Arial" w:cs="Arial"/>
+        </w:rPr>
       </w:pPr>
       <w:r>
         <w:rPr>
-          <w:sz w:val="24"/>
-          <w:szCs w:val="24"/>
+          <w:rFonts w:ascii="Arial" w:hAnsi="Arial" w:cs="Arial"/>
+          <w:b/>
+          <w:bCs/>
+          <w:sz w:val="26"/>
+          <w:szCs w:val="26"/>
         </w:rPr>
-        <w:t>Curso: Calidad de Software</w:t>
+        <w:t>FACULTAD DE INGENIERÍA</w:t>
       </w:r>
     </w:p>
     <w:p>
       <w:pPr>
-        <w:spacing w:after="200"/>
+        <w:spacing w:after="600"/>
         <w:jc w:val="center"/>
+        <w:rPr>
+          <w:rFonts w:ascii="Arial" w:hAnsi="Arial" w:cs="Arial"/>
+        </w:rPr>
       </w:pPr>
       <w:r>
         <w:rPr>
+          <w:rFonts w:ascii="Arial" w:hAnsi="Arial" w:cs="Arial"/>
           <w:b/>
           <w:bCs/>
-          <w:color w:val="1F4E79"/>
-          <w:sz w:val="40"/>
-          <w:szCs w:val="40"/>
+          <w:sz w:val="24"/>
+          <w:szCs w:val="24"/>
         </w:rPr>
-        <w:t>Esquema de Plan de Calidad, Plan de Pruebas y Pruebas de Conformidad</w:t>
+        <w:t xml:space="preserve">CARRERA DE INGENIERÍA DE SOFTWARE </w:t>
       </w:r>
     </w:p>
     <w:p>
       <w:pPr>
-        <w:spacing w:after="1400"/>
+        <w:spacing w:after="480"/>
         <w:jc w:val="center"/>
+        <w:rPr>
+          <w:rFonts w:ascii="Arial" w:hAnsi="Arial" w:cs="Arial"/>
+        </w:rPr>
       </w:pPr>
       <w:r>
         <w:rPr>
-          <w:sz w:val="26"/>
-          <w:szCs w:val="26"/>
+          <w:rFonts w:ascii="Arial" w:hAnsi="Arial" w:cs="Arial"/>
+          <w:b/>
+          <w:bCs/>
+          <w:color w:val="1F4E79"/>
+          <w:sz w:val="30"/>
+          <w:szCs w:val="30"/>
         </w:rPr>
-        <w:t>Sistema: TechStore – Tienda web de tecnología con carrito de compras</w:t>
+        <w:t>ESQUEMA DE PLAN DE CALIDAD, PLAN DE PRUEBAS Y PRUEBAS DE CONFORMIDAD</w:t>
       </w:r>
     </w:p>
     <w:p>
       <w:pPr>
-        <w:spacing w:after="100"/>
+        <w:spacing w:after="480"/>
         <w:jc w:val="center"/>
+        <w:rPr>
+          <w:rFonts w:ascii="Arial" w:hAnsi="Arial" w:cs="Arial"/>
+        </w:rPr>
       </w:pPr>
       <w:r>
         <w:rPr>
+          <w:rFonts w:ascii="Arial" w:hAnsi="Arial" w:cs="Arial"/>
           <w:b/>
           <w:bCs/>
+          <w:sz w:val="26"/>
+          <w:szCs w:val="26"/>
         </w:rPr>
-        <w:t xml:space="preserve">Estudiante: </w:t>
-      </w:r>
-      <w:r>
-        <w:t>Diego Aarón Damián Valdivia</w:t>
+        <w:t>Avance de Proyecto TechStore</w:t>
       </w:r>
     </w:p>
     <w:p>
       <w:pPr>
-        <w:spacing w:after="100"/>
+        <w:spacing w:after="120"/>
         <w:jc w:val="center"/>
+        <w:rPr>
+          <w:rFonts w:ascii="Arial" w:hAnsi="Arial" w:cs="Arial"/>
+        </w:rPr>
       </w:pPr>
       <w:r>
         <w:rPr>
-          <w:b/>
-          <w:bCs/>
+          <w:rFonts w:ascii="Arial" w:hAnsi="Arial" w:cs="Arial"/>
+          <w:sz w:val="24"/>
+          <w:szCs w:val="24"/>
         </w:rPr>
-        <w:t xml:space="preserve">Docente: </w:t>
-      </w:r>
-      <w:r>
-        <w:t>Jorge Luis Blanco Reyna</w:t>
+        <w:t>CURSO: Calidad de Software- Sección 37648</w:t>
       </w:r>
     </w:p>
     <w:p>
       <w:pPr>
-        <w:spacing w:after="100"/>
+        <w:spacing w:after="480"/>
         <w:jc w:val="center"/>
+        <w:rPr>
+          <w:rFonts w:ascii="Arial" w:hAnsi="Arial" w:cs="Arial"/>
+          <w:sz w:val="24"/>
+          <w:szCs w:val="24"/>
+        </w:rPr>
+      </w:pPr>
+    </w:p>
+    <w:p>
+      <w:pPr>
+        <w:spacing w:after="480"/>
+        <w:jc w:val="center"/>
+        <w:rPr>
+          <w:rFonts w:ascii="Arial" w:hAnsi="Arial" w:cs="Arial"/>
+        </w:rPr>
       </w:pPr>
       <w:r>
         <w:rPr>
-          <w:b/>
-          <w:bCs/>
+          <w:rFonts w:ascii="Arial" w:hAnsi="Arial" w:cs="Arial"/>
+          <w:sz w:val="24"/>
+          <w:szCs w:val="24"/>
         </w:rPr>
-        <w:t xml:space="preserve">Versión: </w:t>
-      </w:r>
-      <w:r>
-        <w:t>1.0</w:t>
+        <w:t>PROFESOR: Ing. Jorge Luis Blanco Reyna</w:t>
       </w:r>
     </w:p>
     <w:p>
       <w:pPr>
+        <w:spacing w:after="120"/>
         <w:jc w:val="center"/>
+        <w:rPr>
+          <w:rFonts w:ascii="Arial" w:hAnsi="Arial" w:cs="Arial"/>
+        </w:rPr>
       </w:pPr>
       <w:r>
         <w:rPr>
+          <w:rFonts w:ascii="Arial" w:hAnsi="Arial" w:cs="Arial"/>
           <w:b/>
           <w:bCs/>
+          <w:sz w:val="24"/>
+          <w:szCs w:val="24"/>
         </w:rPr>
-        <w:t xml:space="preserve">Fecha: </w:t>
+        <w:t>INTEGRANTES DEL GRUPO:</w:t>
       </w:r>
+    </w:p>
+    <w:p>
+      <w:pPr>
+        <w:spacing w:after="60"/>
+        <w:jc w:val="center"/>
+        <w:rPr>
+          <w:rFonts w:ascii="Arial" w:hAnsi="Arial" w:cs="Arial"/>
+        </w:rPr>
+      </w:pPr>
       <w:r>
-        <w:t>Octubre de 2026</w:t>
+        <w:rPr>
+          <w:rFonts w:ascii="Arial" w:hAnsi="Arial" w:cs="Arial"/>
+          <w:sz w:val="24"/>
+          <w:szCs w:val="24"/>
+        </w:rPr>
+        <w:t>DAMIÁN VALDIVIA, Diego Aarón</w:t>
       </w:r>
+    </w:p>
+    <w:p>
+      <w:pPr>
+        <w:spacing w:after="700"/>
+        <w:rPr>
+          <w:rFonts w:ascii="Arial" w:hAnsi="Arial" w:cs="Arial"/>
+        </w:rPr>
+      </w:pPr>
+    </w:p>
+    <w:p>
+      <w:pPr>
+        <w:spacing w:after="120"/>
+        <w:jc w:val="center"/>
+        <w:rPr>
+          <w:rFonts w:ascii="Arial" w:hAnsi="Arial" w:cs="Arial"/>
+        </w:rPr>
+      </w:pPr>
+      <w:r>
+        <w:rPr>
+          <w:rFonts w:ascii="Arial" w:hAnsi="Arial" w:cs="Arial"/>
+          <w:b/>
+          <w:bCs/>
+          <w:sz w:val="24"/>
+          <w:szCs w:val="24"/>
+        </w:rPr>
+        <w:t>LIMA – PERÚ</w:t>
+      </w:r>
+    </w:p>
+    <w:p>
+      <w:pPr>
+        <w:spacing w:after="120"/>
+        <w:jc w:val="center"/>
+        <w:rPr>
+          <w:rFonts w:ascii="Arial" w:hAnsi="Arial" w:cs="Arial"/>
+          <w:b/>
+          <w:bCs/>
+          <w:sz w:val="24"/>
+          <w:szCs w:val="24"/>
+        </w:rPr>
+      </w:pPr>
+      <w:r>
+        <w:rPr>
+          <w:rFonts w:ascii="Arial" w:hAnsi="Arial" w:cs="Arial"/>
+          <w:b/>
+          <w:bCs/>
+          <w:sz w:val="24"/>
+          <w:szCs w:val="24"/>
+        </w:rPr>
+        <w:t>2026</w:t>
+      </w:r>
+    </w:p>
+    <w:p>
+      <w:pPr>
+        <w:spacing w:after="120"/>
+        <w:jc w:val="center"/>
+        <w:rPr>
+          <w:rFonts w:ascii="Arial" w:hAnsi="Arial" w:cs="Arial"/>
+          <w:b/>
+          <w:bCs/>
+          <w:sz w:val="24"/>
+          <w:szCs w:val="24"/>
+        </w:rPr>
+      </w:pPr>
     </w:p>
     <w:p>
       <w:r>
         <w:br w:type="page"/>
       </w:r>
     </w:p>
+    <w:p/>
     <w:p>
       <w:pPr>
         <w:spacing w:after="200"/>
@@ -174,7 +329,7 @@
           <w:r>
             <w:fldChar w:fldCharType="separate"/>
           </w:r>
-          <w:hyperlink w:anchor="_Toc242457315" w:history="1">
+          <w:hyperlink w:anchor="_Toc242461879" w:history="1">
             <w:r>
               <w:rPr>
                 <w:rStyle w:val="Hipervnculo"/>
@@ -198,7 +353,7 @@
               <w:rPr>
                 <w:noProof/>
               </w:rPr>
-              <w:instrText xml:space="preserve"> PAGEREF _Toc242457315 \h </w:instrText>
+              <w:instrText xml:space="preserve"> PAGEREF _Toc242461879 \h </w:instrText>
             </w:r>
             <w:r>
               <w:rPr>
@@ -240,7 +395,7 @@
               <w14:ligatures w14:val="standardContextual"/>
             </w:rPr>
           </w:pPr>
-          <w:hyperlink w:anchor="_Toc242457316" w:history="1">
+          <w:hyperlink w:anchor="_Toc242461880" w:history="1">
             <w:r>
               <w:rPr>
                 <w:rStyle w:val="Hipervnculo"/>
@@ -264,7 +419,7 @@
               <w:rPr>
                 <w:noProof/>
               </w:rPr>
-              <w:instrText xml:space="preserve"> PAGEREF _Toc242457316 \h </w:instrText>
+              <w:instrText xml:space="preserve"> PAGEREF _Toc242461880 \h </w:instrText>
             </w:r>
             <w:r>
               <w:rPr>
@@ -306,7 +461,7 @@
               <w14:ligatures w14:val="standardContextual"/>
             </w:rPr>
           </w:pPr>
-          <w:hyperlink w:anchor="_Toc242457317" w:history="1">
+          <w:hyperlink w:anchor="_Toc242461881" w:history="1">
             <w:r>
               <w:rPr>
                 <w:rStyle w:val="Hipervnculo"/>
@@ -330,7 +485,7 @@
               <w:rPr>
                 <w:noProof/>
               </w:rPr>
-              <w:instrText xml:space="preserve"> PAGEREF _Toc242457317 \h </w:instrText>
+              <w:instrText xml:space="preserve"> PAGEREF _Toc242461881 \h </w:instrText>
             </w:r>
             <w:r>
               <w:rPr>
@@ -372,7 +527,7 @@
               <w14:ligatures w14:val="standardContextual"/>
             </w:rPr>
           </w:pPr>
-          <w:hyperlink w:anchor="_Toc242457318" w:history="1">
+          <w:hyperlink w:anchor="_Toc242461882" w:history="1">
             <w:r>
               <w:rPr>
                 <w:rStyle w:val="Hipervnculo"/>
@@ -396,7 +551,7 @@
               <w:rPr>
                 <w:noProof/>
               </w:rPr>
-              <w:instrText xml:space="preserve"> PAGEREF _Toc242457318 \h </w:instrText>
+              <w:instrText xml:space="preserve"> PAGEREF _Toc242461882 \h </w:instrText>
             </w:r>
             <w:r>
               <w:rPr>
@@ -438,7 +593,7 @@
               <w14:ligatures w14:val="standardContextual"/>
             </w:rPr>
           </w:pPr>
-          <w:hyperlink w:anchor="_Toc242457319" w:history="1">
+          <w:hyperlink w:anchor="_Toc242461883" w:history="1">
             <w:r>
               <w:rPr>
                 <w:rStyle w:val="Hipervnculo"/>
@@ -462,7 +617,7 @@
               <w:rPr>
                 <w:noProof/>
               </w:rPr>
-              <w:instrText xml:space="preserve"> PAGEREF _Toc242457319 \h </w:instrText>
+              <w:instrText xml:space="preserve"> PAGEREF _Toc242461883 \h </w:instrText>
             </w:r>
             <w:r>
               <w:rPr>
@@ -504,7 +659,7 @@
               <w14:ligatures w14:val="standardContextual"/>
             </w:rPr>
           </w:pPr>
-          <w:hyperlink w:anchor="_Toc242457320" w:history="1">
+          <w:hyperlink w:anchor="_Toc242461884" w:history="1">
             <w:r>
               <w:rPr>
                 <w:rStyle w:val="Hipervnculo"/>
@@ -528,7 +683,7 @@
               <w:rPr>
                 <w:noProof/>
               </w:rPr>
-              <w:instrText xml:space="preserve"> PAGEREF _Toc242457320 \h </w:instrText>
+              <w:instrText xml:space="preserve"> PAGEREF _Toc242461884 \h </w:instrText>
             </w:r>
             <w:r>
               <w:rPr>
@@ -570,7 +725,7 @@
               <w14:ligatures w14:val="standardContextual"/>
             </w:rPr>
           </w:pPr>
-          <w:hyperlink w:anchor="_Toc242457321" w:history="1">
+          <w:hyperlink w:anchor="_Toc242461885" w:history="1">
             <w:r>
               <w:rPr>
                 <w:rStyle w:val="Hipervnculo"/>
@@ -594,7 +749,7 @@
               <w:rPr>
                 <w:noProof/>
               </w:rPr>
-              <w:instrText xml:space="preserve"> PAGEREF _Toc242457321 \h </w:instrText>
+              <w:instrText xml:space="preserve"> PAGEREF _Toc242461885 \h </w:instrText>
             </w:r>
             <w:r>
               <w:rPr>
@@ -636,7 +791,7 @@
               <w14:ligatures w14:val="standardContextual"/>
             </w:rPr>
           </w:pPr>
-          <w:hyperlink w:anchor="_Toc242457322" w:history="1">
+          <w:hyperlink w:anchor="_Toc242461886" w:history="1">
             <w:r>
               <w:rPr>
                 <w:rStyle w:val="Hipervnculo"/>
@@ -660,7 +815,7 @@
               <w:rPr>
                 <w:noProof/>
               </w:rPr>
-              <w:instrText xml:space="preserve"> PAGEREF _Toc242457322 \h </w:instrText>
+              <w:instrText xml:space="preserve"> PAGEREF _Toc242461886 \h </w:instrText>
             </w:r>
             <w:r>
               <w:rPr>
@@ -702,7 +857,7 @@
               <w14:ligatures w14:val="standardContextual"/>
             </w:rPr>
           </w:pPr>
-          <w:hyperlink w:anchor="_Toc242457323" w:history="1">
+          <w:hyperlink w:anchor="_Toc242461887" w:history="1">
             <w:r>
               <w:rPr>
                 <w:rStyle w:val="Hipervnculo"/>
@@ -726,7 +881,7 @@
               <w:rPr>
                 <w:noProof/>
               </w:rPr>
-              <w:instrText xml:space="preserve"> PAGEREF _Toc242457323 \h </w:instrText>
+              <w:instrText xml:space="preserve"> PAGEREF _Toc242461887 \h </w:instrText>
             </w:r>
             <w:r>
               <w:rPr>
@@ -768,7 +923,7 @@
               <w14:ligatures w14:val="standardContextual"/>
             </w:rPr>
           </w:pPr>
-          <w:hyperlink w:anchor="_Toc242457324" w:history="1">
+          <w:hyperlink w:anchor="_Toc242461888" w:history="1">
             <w:r>
               <w:rPr>
                 <w:rStyle w:val="Hipervnculo"/>
@@ -792,7 +947,7 @@
               <w:rPr>
                 <w:noProof/>
               </w:rPr>
-              <w:instrText xml:space="preserve"> PAGEREF _Toc242457324 \h </w:instrText>
+              <w:instrText xml:space="preserve"> PAGEREF _Toc242461888 \h </w:instrText>
             </w:r>
             <w:r>
               <w:rPr>
@@ -834,7 +989,7 @@
               <w14:ligatures w14:val="standardContextual"/>
             </w:rPr>
           </w:pPr>
-          <w:hyperlink w:anchor="_Toc242457325" w:history="1">
+          <w:hyperlink w:anchor="_Toc242461889" w:history="1">
             <w:r>
               <w:rPr>
                 <w:rStyle w:val="Hipervnculo"/>
@@ -858,7 +1013,7 @@
               <w:rPr>
                 <w:noProof/>
               </w:rPr>
-              <w:instrText xml:space="preserve"> PAGEREF _Toc242457325 \h </w:instrText>
+              <w:instrText xml:space="preserve"> PAGEREF _Toc242461889 \h </w:instrText>
             </w:r>
             <w:r>
               <w:rPr>
@@ -900,7 +1055,7 @@
               <w14:ligatures w14:val="standardContextual"/>
             </w:rPr>
           </w:pPr>
-          <w:hyperlink w:anchor="_Toc242457326" w:history="1">
+          <w:hyperlink w:anchor="_Toc242461890" w:history="1">
             <w:r>
               <w:rPr>
                 <w:rStyle w:val="Hipervnculo"/>
@@ -924,7 +1079,7 @@
               <w:rPr>
                 <w:noProof/>
               </w:rPr>
-              <w:instrText xml:space="preserve"> PAGEREF _Toc242457326 \h </w:instrText>
+              <w:instrText xml:space="preserve"> PAGEREF _Toc242461890 \h </w:instrText>
             </w:r>
             <w:r>
               <w:rPr>
@@ -966,7 +1121,7 @@
               <w14:ligatures w14:val="standardContextual"/>
             </w:rPr>
           </w:pPr>
-          <w:hyperlink w:anchor="_Toc242457327" w:history="1">
+          <w:hyperlink w:anchor="_Toc242461891" w:history="1">
             <w:r>
               <w:rPr>
                 <w:rStyle w:val="Hipervnculo"/>
@@ -990,7 +1145,7 @@
               <w:rPr>
                 <w:noProof/>
               </w:rPr>
-              <w:instrText xml:space="preserve"> PAGEREF _Toc242457327 \h </w:instrText>
+              <w:instrText xml:space="preserve"> PAGEREF _Toc242461891 \h </w:instrText>
             </w:r>
             <w:r>
               <w:rPr>
@@ -1032,7 +1187,7 @@
               <w14:ligatures w14:val="standardContextual"/>
             </w:rPr>
           </w:pPr>
-          <w:hyperlink w:anchor="_Toc242457328" w:history="1">
+          <w:hyperlink w:anchor="_Toc242461892" w:history="1">
             <w:r>
               <w:rPr>
                 <w:rStyle w:val="Hipervnculo"/>
@@ -1056,7 +1211,7 @@
               <w:rPr>
                 <w:noProof/>
               </w:rPr>
-              <w:instrText xml:space="preserve"> PAGEREF _Toc242457328 \h </w:instrText>
+              <w:instrText xml:space="preserve"> PAGEREF _Toc242461892 \h </w:instrText>
             </w:r>
             <w:r>
               <w:rPr>
@@ -1098,7 +1253,7 @@
               <w14:ligatures w14:val="standardContextual"/>
             </w:rPr>
           </w:pPr>
-          <w:hyperlink w:anchor="_Toc242457329" w:history="1">
+          <w:hyperlink w:anchor="_Toc242461893" w:history="1">
             <w:r>
               <w:rPr>
                 <w:rStyle w:val="Hipervnculo"/>
@@ -1122,7 +1277,7 @@
               <w:rPr>
                 <w:noProof/>
               </w:rPr>
-              <w:instrText xml:space="preserve"> PAGEREF _Toc242457329 \h </w:instrText>
+              <w:instrText xml:space="preserve"> PAGEREF _Toc242461893 \h </w:instrText>
             </w:r>
             <w:r>
               <w:rPr>
@@ -1164,7 +1319,7 @@
               <w14:ligatures w14:val="standardContextual"/>
             </w:rPr>
           </w:pPr>
-          <w:hyperlink w:anchor="_Toc242457330" w:history="1">
+          <w:hyperlink w:anchor="_Toc242461894" w:history="1">
             <w:r>
               <w:rPr>
                 <w:rStyle w:val="Hipervnculo"/>
@@ -1188,7 +1343,7 @@
               <w:rPr>
                 <w:noProof/>
               </w:rPr>
-              <w:instrText xml:space="preserve"> PAGEREF _Toc242457330 \h </w:instrText>
+              <w:instrText xml:space="preserve"> PAGEREF _Toc242461894 \h </w:instrText>
             </w:r>
             <w:r>
               <w:rPr>
@@ -1230,7 +1385,7 @@
               <w14:ligatures w14:val="standardContextual"/>
             </w:rPr>
           </w:pPr>
-          <w:hyperlink w:anchor="_Toc242457331" w:history="1">
+          <w:hyperlink w:anchor="_Toc242461895" w:history="1">
             <w:r>
               <w:rPr>
                 <w:rStyle w:val="Hipervnculo"/>
@@ -1254,7 +1409,7 @@
               <w:rPr>
                 <w:noProof/>
               </w:rPr>
-              <w:instrText xml:space="preserve"> PAGEREF _Toc242457331 \h </w:instrText>
+              <w:instrText xml:space="preserve"> PAGEREF _Toc242461895 \h </w:instrText>
             </w:r>
             <w:r>
               <w:rPr>
@@ -1296,7 +1451,7 @@
               <w14:ligatures w14:val="standardContextual"/>
             </w:rPr>
           </w:pPr>
-          <w:hyperlink w:anchor="_Toc242457332" w:history="1">
+          <w:hyperlink w:anchor="_Toc242461896" w:history="1">
             <w:r>
               <w:rPr>
                 <w:rStyle w:val="Hipervnculo"/>
@@ -1320,7 +1475,7 @@
               <w:rPr>
                 <w:noProof/>
               </w:rPr>
-              <w:instrText xml:space="preserve"> PAGEREF _Toc242457332 \h </w:instrText>
+              <w:instrText xml:space="preserve"> PAGEREF _Toc242461896 \h </w:instrText>
             </w:r>
             <w:r>
               <w:rPr>
@@ -1362,7 +1517,7 @@
               <w14:ligatures w14:val="standardContextual"/>
             </w:rPr>
           </w:pPr>
-          <w:hyperlink w:anchor="_Toc242457333" w:history="1">
+          <w:hyperlink w:anchor="_Toc242461897" w:history="1">
             <w:r>
               <w:rPr>
                 <w:rStyle w:val="Hipervnculo"/>
@@ -1386,7 +1541,7 @@
               <w:rPr>
                 <w:noProof/>
               </w:rPr>
-              <w:instrText xml:space="preserve"> PAGEREF _Toc242457333 \h </w:instrText>
+              <w:instrText xml:space="preserve"> PAGEREF _Toc242461897 \h </w:instrText>
             </w:r>
             <w:r>
               <w:rPr>
@@ -1428,7 +1583,7 @@
               <w14:ligatures w14:val="standardContextual"/>
             </w:rPr>
           </w:pPr>
-          <w:hyperlink w:anchor="_Toc242457334" w:history="1">
+          <w:hyperlink w:anchor="_Toc242461898" w:history="1">
             <w:r>
               <w:rPr>
                 <w:rStyle w:val="Hipervnculo"/>
@@ -1452,7 +1607,7 @@
               <w:rPr>
                 <w:noProof/>
               </w:rPr>
-              <w:instrText xml:space="preserve"> PAGEREF _Toc242457334 \h </w:instrText>
+              <w:instrText xml:space="preserve"> PAGEREF _Toc242461898 \h </w:instrText>
             </w:r>
             <w:r>
               <w:rPr>
@@ -1494,7 +1649,7 @@
               <w14:ligatures w14:val="standardContextual"/>
             </w:rPr>
           </w:pPr>
-          <w:hyperlink w:anchor="_Toc242457335" w:history="1">
+          <w:hyperlink w:anchor="_Toc242461899" w:history="1">
             <w:r>
               <w:rPr>
                 <w:rStyle w:val="Hipervnculo"/>
@@ -1518,7 +1673,7 @@
               <w:rPr>
                 <w:noProof/>
               </w:rPr>
-              <w:instrText xml:space="preserve"> PAGEREF _Toc242457335 \h </w:instrText>
+              <w:instrText xml:space="preserve"> PAGEREF _Toc242461899 \h </w:instrText>
             </w:r>
             <w:r>
               <w:rPr>
@@ -1560,7 +1715,7 @@
               <w14:ligatures w14:val="standardContextual"/>
             </w:rPr>
           </w:pPr>
-          <w:hyperlink w:anchor="_Toc242457336" w:history="1">
+          <w:hyperlink w:anchor="_Toc242461900" w:history="1">
             <w:r>
               <w:rPr>
                 <w:rStyle w:val="Hipervnculo"/>
@@ -1584,7 +1739,7 @@
               <w:rPr>
                 <w:noProof/>
               </w:rPr>
-              <w:instrText xml:space="preserve"> PAGEREF _Toc242457336 \h </w:instrText>
+              <w:instrText xml:space="preserve"> PAGEREF _Toc242461900 \h </w:instrText>
             </w:r>
             <w:r>
               <w:rPr>
@@ -1626,7 +1781,7 @@
               <w14:ligatures w14:val="standardContextual"/>
             </w:rPr>
           </w:pPr>
-          <w:hyperlink w:anchor="_Toc242457337" w:history="1">
+          <w:hyperlink w:anchor="_Toc242461901" w:history="1">
             <w:r>
               <w:rPr>
                 <w:rStyle w:val="Hipervnculo"/>
@@ -1650,7 +1805,7 @@
               <w:rPr>
                 <w:noProof/>
               </w:rPr>
-              <w:instrText xml:space="preserve"> PAGEREF _Toc242457337 \h </w:instrText>
+              <w:instrText xml:space="preserve"> PAGEREF _Toc242461901 \h </w:instrText>
             </w:r>
             <w:r>
               <w:rPr>
@@ -1692,7 +1847,7 @@
               <w14:ligatures w14:val="standardContextual"/>
             </w:rPr>
           </w:pPr>
-          <w:hyperlink w:anchor="_Toc242457338" w:history="1">
+          <w:hyperlink w:anchor="_Toc242461902" w:history="1">
             <w:r>
               <w:rPr>
                 <w:rStyle w:val="Hipervnculo"/>
@@ -1716,7 +1871,7 @@
               <w:rPr>
                 <w:noProof/>
               </w:rPr>
-              <w:instrText xml:space="preserve"> PAGEREF _Toc242457338 \h </w:instrText>
+              <w:instrText xml:space="preserve"> PAGEREF _Toc242461902 \h </w:instrText>
             </w:r>
             <w:r>
               <w:rPr>
@@ -1758,7 +1913,7 @@
               <w14:ligatures w14:val="standardContextual"/>
             </w:rPr>
           </w:pPr>
-          <w:hyperlink w:anchor="_Toc242457339" w:history="1">
+          <w:hyperlink w:anchor="_Toc242461903" w:history="1">
             <w:r>
               <w:rPr>
                 <w:rStyle w:val="Hipervnculo"/>
@@ -1782,7 +1937,7 @@
               <w:rPr>
                 <w:noProof/>
               </w:rPr>
-              <w:instrText xml:space="preserve"> PAGEREF _Toc242457339 \h </w:instrText>
+              <w:instrText xml:space="preserve"> PAGEREF _Toc242461903 \h </w:instrText>
             </w:r>
             <w:r>
               <w:rPr>
@@ -1824,7 +1979,7 @@
               <w14:ligatures w14:val="standardContextual"/>
             </w:rPr>
           </w:pPr>
-          <w:hyperlink w:anchor="_Toc242457340" w:history="1">
+          <w:hyperlink w:anchor="_Toc242461904" w:history="1">
             <w:r>
               <w:rPr>
                 <w:rStyle w:val="Hipervnculo"/>
@@ -1848,7 +2003,7 @@
               <w:rPr>
                 <w:noProof/>
               </w:rPr>
-              <w:instrText xml:space="preserve"> PAGEREF _Toc242457340 \h </w:instrText>
+              <w:instrText xml:space="preserve"> PAGEREF _Toc242461904 \h </w:instrText>
             </w:r>
             <w:r>
               <w:rPr>
@@ -1890,7 +2045,7 @@
               <w14:ligatures w14:val="standardContextual"/>
             </w:rPr>
           </w:pPr>
-          <w:hyperlink w:anchor="_Toc242457341" w:history="1">
+          <w:hyperlink w:anchor="_Toc242461905" w:history="1">
             <w:r>
               <w:rPr>
                 <w:rStyle w:val="Hipervnculo"/>
@@ -1914,7 +2069,7 @@
               <w:rPr>
                 <w:noProof/>
               </w:rPr>
-              <w:instrText xml:space="preserve"> PAGEREF _Toc242457341 \h </w:instrText>
+              <w:instrText xml:space="preserve"> PAGEREF _Toc242461905 \h </w:instrText>
             </w:r>
             <w:r>
               <w:rPr>
@@ -1956,7 +2111,7 @@
               <w14:ligatures w14:val="standardContextual"/>
             </w:rPr>
           </w:pPr>
-          <w:hyperlink w:anchor="_Toc242457342" w:history="1">
+          <w:hyperlink w:anchor="_Toc242461906" w:history="1">
             <w:r>
               <w:rPr>
                 <w:rStyle w:val="Hipervnculo"/>
@@ -1980,7 +2135,7 @@
               <w:rPr>
                 <w:noProof/>
               </w:rPr>
-              <w:instrText xml:space="preserve"> PAGEREF _Toc242457342 \h </w:instrText>
+              <w:instrText xml:space="preserve"> PAGEREF _Toc242461906 \h </w:instrText>
             </w:r>
             <w:r>
               <w:rPr>
@@ -2023,7 +2178,7 @@
       <w:pPr>
         <w:pStyle w:val="Ttulo1"/>
       </w:pPr>
-      <w:bookmarkStart w:id="0" w:name="_Toc242457315"/>
+      <w:bookmarkStart w:id="0" w:name="_Toc242461879"/>
       <w:r>
         <w:lastRenderedPageBreak/>
         <w:t>Introducción</w:t>
@@ -2048,7 +2203,7 @@
       <w:pPr>
         <w:pStyle w:val="Ttulo2"/>
       </w:pPr>
-      <w:bookmarkStart w:id="1" w:name="_Toc242457316"/>
+      <w:bookmarkStart w:id="1" w:name="_Toc242461880"/>
       <w:r>
         <w:t>Sistema bajo evaluación</w:t>
       </w:r>
@@ -2395,7 +2550,7 @@
       <w:pPr>
         <w:pStyle w:val="Ttulo1"/>
       </w:pPr>
-      <w:bookmarkStart w:id="2" w:name="_Toc242457317"/>
+      <w:bookmarkStart w:id="2" w:name="_Toc242461881"/>
       <w:r>
         <w:t>Parte I. Plan de Calidad</w:t>
       </w:r>
@@ -2405,7 +2560,7 @@
       <w:pPr>
         <w:pStyle w:val="Ttulo2"/>
       </w:pPr>
-      <w:bookmarkStart w:id="3" w:name="_Toc242457318"/>
+      <w:bookmarkStart w:id="3" w:name="_Toc242461882"/>
       <w:r>
         <w:t>1. Objetivos de calidad</w:t>
       </w:r>
@@ -2480,7 +2635,7 @@
       <w:pPr>
         <w:pStyle w:val="Ttulo2"/>
       </w:pPr>
-      <w:bookmarkStart w:id="4" w:name="_Toc242457319"/>
+      <w:bookmarkStart w:id="4" w:name="_Toc242461883"/>
       <w:r>
         <w:t>2. Alcance</w:t>
       </w:r>
@@ -2498,7 +2653,7 @@
       <w:pPr>
         <w:pStyle w:val="Ttulo2"/>
       </w:pPr>
-      <w:bookmarkStart w:id="5" w:name="_Toc242457320"/>
+      <w:bookmarkStart w:id="5" w:name="_Toc242461884"/>
       <w:r>
         <w:t>3. Normas y estándares aplicables</w:t>
       </w:r>
@@ -2931,7 +3086,7 @@
       <w:pPr>
         <w:pStyle w:val="Ttulo2"/>
       </w:pPr>
-      <w:bookmarkStart w:id="6" w:name="_Toc242457321"/>
+      <w:bookmarkStart w:id="6" w:name="_Toc242461885"/>
       <w:r>
         <w:t>4. Roles y responsabilidades</w:t>
       </w:r>
@@ -3340,7 +3495,7 @@
       <w:pPr>
         <w:pStyle w:val="Ttulo2"/>
       </w:pPr>
-      <w:bookmarkStart w:id="7" w:name="_Toc242457322"/>
+      <w:bookmarkStart w:id="7" w:name="_Toc242461886"/>
       <w:r>
         <w:t>5. Métricas de calidad</w:t>
       </w:r>
@@ -4839,7 +4994,7 @@
       <w:pPr>
         <w:pStyle w:val="Ttulo2"/>
       </w:pPr>
-      <w:bookmarkStart w:id="8" w:name="_Toc242457323"/>
+      <w:bookmarkStart w:id="8" w:name="_Toc242461887"/>
       <w:r>
         <w:t>6. Estrategias de aseguramiento</w:t>
       </w:r>
@@ -4929,7 +5084,7 @@
       <w:pPr>
         <w:pStyle w:val="Ttulo2"/>
       </w:pPr>
-      <w:bookmarkStart w:id="9" w:name="_Toc242457324"/>
+      <w:bookmarkStart w:id="9" w:name="_Toc242461888"/>
       <w:r>
         <w:t>7. Plan de revisión y auditoría</w:t>
       </w:r>
@@ -4978,7 +5133,7 @@
       <w:pPr>
         <w:pStyle w:val="Ttulo2"/>
       </w:pPr>
-      <w:bookmarkStart w:id="10" w:name="_Toc242457325"/>
+      <w:bookmarkStart w:id="10" w:name="_Toc242461889"/>
       <w:r>
         <w:t>8. Herramientas de apoyo</w:t>
       </w:r>
@@ -5317,7 +5472,7 @@
       <w:pPr>
         <w:pStyle w:val="Ttulo2"/>
       </w:pPr>
-      <w:bookmarkStart w:id="11" w:name="_Toc242457326"/>
+      <w:bookmarkStart w:id="11" w:name="_Toc242461890"/>
       <w:r>
         <w:t>9. Criterios de aceptación del producto</w:t>
       </w:r>
@@ -5397,7 +5552,7 @@
       <w:pPr>
         <w:pStyle w:val="Ttulo1"/>
       </w:pPr>
-      <w:bookmarkStart w:id="12" w:name="_Toc242457327"/>
+      <w:bookmarkStart w:id="12" w:name="_Toc242461891"/>
       <w:r>
         <w:t>Parte II. Plan de Pruebas</w:t>
       </w:r>
@@ -5407,7 +5562,7 @@
       <w:pPr>
         <w:pStyle w:val="Ttulo2"/>
       </w:pPr>
-      <w:bookmarkStart w:id="13" w:name="_Toc242457328"/>
+      <w:bookmarkStart w:id="13" w:name="_Toc242461892"/>
       <w:r>
         <w:t>1. Alcance</w:t>
       </w:r>
@@ -5447,7 +5602,7 @@
       <w:pPr>
         <w:pStyle w:val="Ttulo2"/>
       </w:pPr>
-      <w:bookmarkStart w:id="14" w:name="_Toc242457329"/>
+      <w:bookmarkStart w:id="14" w:name="_Toc242461893"/>
       <w:r>
         <w:t>2. Objetivos</w:t>
       </w:r>
@@ -5496,7 +5651,7 @@
       <w:pPr>
         <w:pStyle w:val="Ttulo2"/>
       </w:pPr>
-      <w:bookmarkStart w:id="15" w:name="_Toc242457330"/>
+      <w:bookmarkStart w:id="15" w:name="_Toc242461894"/>
       <w:r>
         <w:t>3. Estrategia por niveles</w:t>
       </w:r>
@@ -6027,7 +6182,7 @@
       <w:pPr>
         <w:pStyle w:val="Ttulo2"/>
       </w:pPr>
-      <w:bookmarkStart w:id="16" w:name="_Toc242457331"/>
+      <w:bookmarkStart w:id="16" w:name="_Toc242461895"/>
       <w:r>
         <w:t>4. Tipos de pruebas</w:t>
       </w:r>
@@ -7036,7 +7191,7 @@
       <w:pPr>
         <w:pStyle w:val="Ttulo2"/>
       </w:pPr>
-      <w:bookmarkStart w:id="17" w:name="_Toc242457332"/>
+      <w:bookmarkStart w:id="17" w:name="_Toc242461896"/>
       <w:r>
         <w:t>5. Criterios de entrada, salida y suspensión</w:t>
       </w:r>
@@ -7273,7 +7428,7 @@
       <w:pPr>
         <w:pStyle w:val="Ttulo2"/>
       </w:pPr>
-      <w:bookmarkStart w:id="18" w:name="_Toc242457333"/>
+      <w:bookmarkStart w:id="18" w:name="_Toc242461897"/>
       <w:r>
         <w:t>6. Criterios de aceptación (casos de prueba representativos)</w:t>
       </w:r>
@@ -8580,7 +8735,7 @@
       <w:pPr>
         <w:pStyle w:val="Ttulo2"/>
       </w:pPr>
-      <w:bookmarkStart w:id="19" w:name="_Toc242457334"/>
+      <w:bookmarkStart w:id="19" w:name="_Toc242461898"/>
       <w:r>
         <w:t>7. Recursos y responsabilidades</w:t>
       </w:r>
@@ -9018,7 +9173,7 @@
       <w:pPr>
         <w:pStyle w:val="Ttulo2"/>
       </w:pPr>
-      <w:bookmarkStart w:id="20" w:name="_Toc242457335"/>
+      <w:bookmarkStart w:id="20" w:name="_Toc242461899"/>
       <w:r>
         <w:t>8. Cronograma</w:t>
       </w:r>
@@ -9498,7 +9653,7 @@
       <w:pPr>
         <w:pStyle w:val="Ttulo2"/>
       </w:pPr>
-      <w:bookmarkStart w:id="21" w:name="_Toc242457336"/>
+      <w:bookmarkStart w:id="21" w:name="_Toc242461900"/>
       <w:r>
         <w:t>9. Métricas de prueba</w:t>
       </w:r>
@@ -9560,7 +9715,7 @@
       <w:pPr>
         <w:pStyle w:val="Ttulo2"/>
       </w:pPr>
-      <w:bookmarkStart w:id="22" w:name="_Toc242457337"/>
+      <w:bookmarkStart w:id="22" w:name="_Toc242461901"/>
       <w:r>
         <w:t>10. Riesgos y mitigación</w:t>
       </w:r>
@@ -9852,7 +10007,7 @@
       <w:pPr>
         <w:pStyle w:val="Ttulo2"/>
       </w:pPr>
-      <w:bookmarkStart w:id="23" w:name="_Toc242457338"/>
+      <w:bookmarkStart w:id="23" w:name="_Toc242461902"/>
       <w:r>
         <w:t>11. Aprobación</w:t>
       </w:r>
@@ -9927,7 +10082,7 @@
       <w:pPr>
         <w:pStyle w:val="Ttulo1"/>
       </w:pPr>
-      <w:bookmarkStart w:id="24" w:name="_Toc242457339"/>
+      <w:bookmarkStart w:id="24" w:name="_Toc242461903"/>
       <w:r>
         <w:t>Parte III. Pruebas de Conformidad</w:t>
       </w:r>
@@ -9962,7 +10117,7 @@
       <w:pPr>
         <w:pStyle w:val="Ttulo2"/>
       </w:pPr>
-      <w:bookmarkStart w:id="25" w:name="_Toc242457340"/>
+      <w:bookmarkStart w:id="25" w:name="_Toc242461904"/>
       <w:r>
         <w:t>1. Normas y regulaciones que deben cumplirse</w:t>
       </w:r>
@@ -10690,7 +10845,7 @@
       <w:pPr>
         <w:pStyle w:val="Ttulo2"/>
       </w:pPr>
-      <w:bookmarkStart w:id="26" w:name="_Toc242457341"/>
+      <w:bookmarkStart w:id="26" w:name="_Toc242461905"/>
       <w:r>
         <w:t>2. Casos de conformidad</w:t>
       </w:r>
@@ -12840,7 +12995,7 @@
       <w:pPr>
         <w:pStyle w:val="Ttulo2"/>
       </w:pPr>
-      <w:bookmarkStart w:id="27" w:name="_Toc242457342"/>
+      <w:bookmarkStart w:id="27" w:name="_Toc242461906"/>
       <w:r>
         <w:t>3. Matriz de resultados de conformidad</w:t>
       </w:r>
@@ -13817,10 +13972,16 @@
       </w:r>
     </w:p>
     <w:sectPr>
-      <w:footerReference w:type="default" r:id="rId7"/>
+      <w:headerReference w:type="even" r:id="rId8"/>
+      <w:headerReference w:type="default" r:id="rId9"/>
+      <w:footerReference w:type="even" r:id="rId10"/>
+      <w:footerReference w:type="default" r:id="rId11"/>
+      <w:headerReference w:type="first" r:id="rId12"/>
+      <w:footerReference w:type="first" r:id="rId13"/>
       <w:pgSz w:w="11906" w:h="16838"/>
       <w:pgMar w:top="1134" w:right="1134" w:bottom="1134" w:left="1134" w:header="708" w:footer="708" w:gutter="0"/>
       <w:cols w:space="720"/>
+      <w:titlePg/>
       <w:docGrid w:linePitch="360"/>
     </w:sectPr>
   </w:body>
@@ -13847,6 +14008,16 @@
 </file>
 
 <file path=word/footer1.xml><?xml version="1.0" encoding="utf-8"?>
+<w:ftr xmlns:wpc="http://schemas.microsoft.com/office/word/2010/wordprocessingCanvas" xmlns:cx="http://schemas.microsoft.com/office/drawing/2014/chartex" xmlns:cx1="http://schemas.microsoft.com/office/drawing/2015/9/8/chartex" xmlns:cx2="http://schemas.microsoft.com/office/drawing/2015/10/21/chartex" xmlns:cx3="http://schemas.microsoft.com/office/drawing/2016/5/9/chartex" xmlns:cx4="http://schemas.microsoft.com/office/drawing/2016/5/10/chartex" xmlns:cx5="http://schemas.microsoft.com/office/drawing/2016/5/11/chartex" xmlns:cx6="http://schemas.microsoft.com/office/drawing/2016/5/12/chartex" xmlns:cx7="http://schemas.microsoft.com/office/drawing/2016/5/13/chartex" xmlns:cx8="http://schemas.microsoft.com/office/drawing/2016/5/14/chartex" xmlns:mc="http://schemas.openxmlformats.org/markup-compatibility/2006" xmlns:aink="http://schemas.microsoft.com/office/drawing/2016/ink" xmlns:am3d="http://schemas.microsoft.com/office/drawing/2017/model3d" xmlns:o="urn:schemas-microsoft-com:office:office" xmlns:oel="http://schemas.microsoft.com/office/2019/extlst" xmlns:r="http://schemas.openxmlformats.org/officeDocument/2006/relationships" xmlns:m="http://schemas.openxmlformats.org/officeDocument/2006/math" xmlns:v="urn:schemas-microsoft-com:vml" xmlns:wp14="http://schemas.microsoft.com/office/word/2010/wordprocessingDrawing" xmlns:wp="http://schemas.openxmlformats.org/drawingml/2006/wordprocessingDrawing" xmlns:w10="urn:schemas-microsoft-com:office:word" xmlns:w="http://schemas.openxmlformats.org/wordprocessingml/2006/main" xmlns:w14="http://schemas.microsoft.com/office/word/2010/wordml" xmlns:w15="http://schemas.microsoft.com/office/word/2012/wordml" xmlns:w16cex="http://schemas.microsoft.com/office/word/2018/wordml/cex" xmlns:w16cid="http://schemas.microsoft.com/office/word/2016/wordml/cid" xmlns:w16="http://schemas.microsoft.com/office/word/2018/wordml" xmlns:w16du="http://schemas.microsoft.com/office/word/2023/wordml/word16du" xmlns:w16sdtdh="http://schemas.microsoft.com/office/word/2020/wordml/sdtdatahash" xmlns:w16sdtfl="http://schemas.microsoft.com/office/word/2024/wordml/sdtformatlock" xmlns:w16se="http://schemas.microsoft.com/office/word/2015/wordml/symex" xmlns:wpg="http://schemas.microsoft.com/office/word/2010/wordprocessingGroup" xmlns:wpi="http://schemas.microsoft.com/office/word/2010/wordprocessingInk" xmlns:wne="http://schemas.microsoft.com/office/word/2006/wordml" xmlns:wps="http://schemas.microsoft.com/office/word/2010/wordprocessingShape" mc:Ignorable="w14 w15 w16se w16cid w16 w16cex w16sdtdh w16sdtfl w16du wp14">
+  <w:p>
+    <w:pPr>
+      <w:pStyle w:val="Piedepgina"/>
+    </w:pPr>
+  </w:p>
+</w:ftr>
+</file>
+
+<file path=word/footer2.xml><?xml version="1.0" encoding="utf-8"?>
 <w:ftr xmlns:wpc="http://schemas.microsoft.com/office/word/2010/wordprocessingCanvas" xmlns:cx="http://schemas.microsoft.com/office/drawing/2014/chartex" xmlns:cx1="http://schemas.microsoft.com/office/drawing/2015/9/8/chartex" xmlns:cx2="http://schemas.microsoft.com/office/drawing/2015/10/21/chartex" xmlns:cx3="http://schemas.microsoft.com/office/drawing/2016/5/9/chartex" xmlns:cx4="http://schemas.microsoft.com/office/drawing/2016/5/10/chartex" xmlns:cx5="http://schemas.microsoft.com/office/drawing/2016/5/11/chartex" xmlns:cx6="http://schemas.microsoft.com/office/drawing/2016/5/12/chartex" xmlns:cx7="http://schemas.microsoft.com/office/drawing/2016/5/13/chartex" xmlns:cx8="http://schemas.microsoft.com/office/drawing/2016/5/14/chartex" xmlns:mc="http://schemas.openxmlformats.org/markup-compatibility/2006" xmlns:aink="http://schemas.microsoft.com/office/drawing/2016/ink" xmlns:am3d="http://schemas.microsoft.com/office/drawing/2017/model3d" xmlns:o="urn:schemas-microsoft-com:office:office" xmlns:oel="http://schemas.microsoft.com/office/2019/extlst" xmlns:r="http://schemas.openxmlformats.org/officeDocument/2006/relationships" xmlns:m="http://schemas.openxmlformats.org/officeDocument/2006/math" xmlns:v="urn:schemas-microsoft-com:vml" xmlns:wp14="http://schemas.microsoft.com/office/word/2010/wordprocessingDrawing" xmlns:wp="http://schemas.openxmlformats.org/drawingml/2006/wordprocessingDrawing" xmlns:w10="urn:schemas-microsoft-com:office:word" xmlns:w="http://schemas.openxmlformats.org/wordprocessingml/2006/main" xmlns:w14="http://schemas.microsoft.com/office/word/2010/wordml" xmlns:w15="http://schemas.microsoft.com/office/word/2012/wordml" xmlns:w16cex="http://schemas.microsoft.com/office/word/2018/wordml/cex" xmlns:w16cid="http://schemas.microsoft.com/office/word/2016/wordml/cid" xmlns:w16="http://schemas.microsoft.com/office/word/2018/wordml" xmlns:w16du="http://schemas.microsoft.com/office/word/2023/wordml/word16du" xmlns:w16sdtdh="http://schemas.microsoft.com/office/word/2020/wordml/sdtdatahash" xmlns:w16sdtfl="http://schemas.microsoft.com/office/word/2024/wordml/sdtformatlock" xmlns:w16se="http://schemas.microsoft.com/office/word/2015/wordml/symex" xmlns:wpg="http://schemas.microsoft.com/office/word/2010/wordprocessingGroup" xmlns:wpi="http://schemas.microsoft.com/office/word/2010/wordprocessingInk" xmlns:wne="http://schemas.microsoft.com/office/word/2006/wordml" xmlns:wps="http://schemas.microsoft.com/office/word/2010/wordprocessingShape" mc:Ignorable="w14 w15 w16se w16cid w16 w16cex w16sdtdh w16sdtfl w16du wp14">
   <w:p>
     <w:pPr>
@@ -13905,6 +14076,16 @@
 </w:ftr>
 </file>
 
+<file path=word/footer3.xml><?xml version="1.0" encoding="utf-8"?>
+<w:ftr xmlns:wpc="http://schemas.microsoft.com/office/word/2010/wordprocessingCanvas" xmlns:cx="http://schemas.microsoft.com/office/drawing/2014/chartex" xmlns:cx1="http://schemas.microsoft.com/office/drawing/2015/9/8/chartex" xmlns:cx2="http://schemas.microsoft.com/office/drawing/2015/10/21/chartex" xmlns:cx3="http://schemas.microsoft.com/office/drawing/2016/5/9/chartex" xmlns:cx4="http://schemas.microsoft.com/office/drawing/2016/5/10/chartex" xmlns:cx5="http://schemas.microsoft.com/office/drawing/2016/5/11/chartex" xmlns:cx6="http://schemas.microsoft.com/office/drawing/2016/5/12/chartex" xmlns:cx7="http://schemas.microsoft.com/office/drawing/2016/5/13/chartex" xmlns:cx8="http://schemas.microsoft.com/office/drawing/2016/5/14/chartex" xmlns:mc="http://schemas.openxmlformats.org/markup-compatibility/2006" xmlns:aink="http://schemas.microsoft.com/office/drawing/2016/ink" xmlns:am3d="http://schemas.microsoft.com/office/drawing/2017/model3d" xmlns:o="urn:schemas-microsoft-com:office:office" xmlns:oel="http://schemas.microsoft.com/office/2019/extlst" xmlns:r="http://schemas.openxmlformats.org/officeDocument/2006/relationships" xmlns:m="http://schemas.openxmlformats.org/officeDocument/2006/math" xmlns:v="urn:schemas-microsoft-com:vml" xmlns:wp14="http://schemas.microsoft.com/office/word/2010/wordprocessingDrawing" xmlns:wp="http://schemas.openxmlformats.org/drawingml/2006/wordprocessingDrawing" xmlns:w10="urn:schemas-microsoft-com:office:word" xmlns:w="http://schemas.openxmlformats.org/wordprocessingml/2006/main" xmlns:w14="http://schemas.microsoft.com/office/word/2010/wordml" xmlns:w15="http://schemas.microsoft.com/office/word/2012/wordml" xmlns:w16cex="http://schemas.microsoft.com/office/word/2018/wordml/cex" xmlns:w16cid="http://schemas.microsoft.com/office/word/2016/wordml/cid" xmlns:w16="http://schemas.microsoft.com/office/word/2018/wordml" xmlns:w16du="http://schemas.microsoft.com/office/word/2023/wordml/word16du" xmlns:w16sdtdh="http://schemas.microsoft.com/office/word/2020/wordml/sdtdatahash" xmlns:w16sdtfl="http://schemas.microsoft.com/office/word/2024/wordml/sdtformatlock" xmlns:w16se="http://schemas.microsoft.com/office/word/2015/wordml/symex" xmlns:wpg="http://schemas.microsoft.com/office/word/2010/wordprocessingGroup" xmlns:wpi="http://schemas.microsoft.com/office/word/2010/wordprocessingInk" xmlns:wne="http://schemas.microsoft.com/office/word/2006/wordml" xmlns:wps="http://schemas.microsoft.com/office/word/2010/wordprocessingShape" mc:Ignorable="w14 w15 w16se w16cid w16 w16cex w16sdtdh w16sdtfl w16du wp14">
+  <w:p>
+    <w:pPr>
+      <w:pStyle w:val="Piedepgina"/>
+    </w:pPr>
+  </w:p>
+</w:ftr>
+</file>
+
 <file path=word/footnotes.xml><?xml version="1.0" encoding="utf-8"?>
 <w:footnotes xmlns:wpc="http://schemas.microsoft.com/office/word/2010/wordprocessingCanvas" xmlns:cx="http://schemas.microsoft.com/office/drawing/2014/chartex" xmlns:cx1="http://schemas.microsoft.com/office/drawing/2015/9/8/chartex" xmlns:cx2="http://schemas.microsoft.com/office/drawing/2015/10/21/chartex" xmlns:cx3="http://schemas.microsoft.com/office/drawing/2016/5/9/chartex" xmlns:cx4="http://schemas.microsoft.com/office/drawing/2016/5/10/chartex" xmlns:cx5="http://schemas.microsoft.com/office/drawing/2016/5/11/chartex" xmlns:cx6="http://schemas.microsoft.com/office/drawing/2016/5/12/chartex" xmlns:cx7="http://schemas.microsoft.com/office/drawing/2016/5/13/chartex" xmlns:cx8="http://schemas.microsoft.com/office/drawing/2016/5/14/chartex" xmlns:mc="http://schemas.openxmlformats.org/markup-compatibility/2006" xmlns:aink="http://schemas.microsoft.com/office/drawing/2016/ink" xmlns:am3d="http://schemas.microsoft.com/office/drawing/2017/model3d" xmlns:o="urn:schemas-microsoft-com:office:office" xmlns:oel="http://schemas.microsoft.com/office/2019/extlst" xmlns:r="http://schemas.openxmlformats.org/officeDocument/2006/relationships" xmlns:m="http://schemas.openxmlformats.org/officeDocument/2006/math" xmlns:v="urn:schemas-microsoft-com:vml" xmlns:wp14="http://schemas.microsoft.com/office/word/2010/wordprocessingDrawing" xmlns:wp="http://schemas.openxmlformats.org/drawingml/2006/wordprocessingDrawing" xmlns:w10="urn:schemas-microsoft-com:office:word" xmlns:w="http://schemas.openxmlformats.org/wordprocessingml/2006/main" xmlns:w14="http://schemas.microsoft.com/office/word/2010/wordml" xmlns:w15="http://schemas.microsoft.com/office/word/2012/wordml" xmlns:w16cex="http://schemas.microsoft.com/office/word/2018/wordml/cex" xmlns:w16cid="http://schemas.microsoft.com/office/word/2016/wordml/cid" xmlns:w16="http://schemas.microsoft.com/office/word/2018/wordml" xmlns:w16du="http://schemas.microsoft.com/office/word/2023/wordml/word16du" xmlns:w16sdtdh="http://schemas.microsoft.com/office/word/2020/wordml/sdtdatahash" xmlns:w16sdtfl="http://schemas.microsoft.com/office/word/2024/wordml/sdtformatlock" xmlns:w16se="http://schemas.microsoft.com/office/word/2015/wordml/symex" xmlns:wpg="http://schemas.microsoft.com/office/word/2010/wordprocessingGroup" xmlns:wpi="http://schemas.microsoft.com/office/word/2010/wordprocessingInk" xmlns:wne="http://schemas.microsoft.com/office/word/2006/wordml" xmlns:wps="http://schemas.microsoft.com/office/word/2010/wordprocessingShape" mc:Ignorable="w14 w15 w16se w16cid w16 w16cex w16sdtdh w16sdtfl w16du wp14">
   <w:footnote w:type="separator" w:id="-1">
@@ -13922,6 +14103,36 @@
     </w:p>
   </w:footnote>
 </w:footnotes>
+</file>
+
+<file path=word/header1.xml><?xml version="1.0" encoding="utf-8"?>
+<w:hdr xmlns:wpc="http://schemas.microsoft.com/office/word/2010/wordprocessingCanvas" xmlns:cx="http://schemas.microsoft.com/office/drawing/2014/chartex" xmlns:cx1="http://schemas.microsoft.com/office/drawing/2015/9/8/chartex" xmlns:cx2="http://schemas.microsoft.com/office/drawing/2015/10/21/chartex" xmlns:cx3="http://schemas.microsoft.com/office/drawing/2016/5/9/chartex" xmlns:cx4="http://schemas.microsoft.com/office/drawing/2016/5/10/chartex" xmlns:cx5="http://schemas.microsoft.com/office/drawing/2016/5/11/chartex" xmlns:cx6="http://schemas.microsoft.com/office/drawing/2016/5/12/chartex" xmlns:cx7="http://schemas.microsoft.com/office/drawing/2016/5/13/chartex" xmlns:cx8="http://schemas.microsoft.com/office/drawing/2016/5/14/chartex" xmlns:mc="http://schemas.openxmlformats.org/markup-compatibility/2006" xmlns:aink="http://schemas.microsoft.com/office/drawing/2016/ink" xmlns:am3d="http://schemas.microsoft.com/office/drawing/2017/model3d" xmlns:o="urn:schemas-microsoft-com:office:office" xmlns:oel="http://schemas.microsoft.com/office/2019/extlst" xmlns:r="http://schemas.openxmlformats.org/officeDocument/2006/relationships" xmlns:m="http://schemas.openxmlformats.org/officeDocument/2006/math" xmlns:v="urn:schemas-microsoft-com:vml" xmlns:wp14="http://schemas.microsoft.com/office/word/2010/wordprocessingDrawing" xmlns:wp="http://schemas.openxmlformats.org/drawingml/2006/wordprocessingDrawing" xmlns:w10="urn:schemas-microsoft-com:office:word" xmlns:w="http://schemas.openxmlformats.org/wordprocessingml/2006/main" xmlns:w14="http://schemas.microsoft.com/office/word/2010/wordml" xmlns:w15="http://schemas.microsoft.com/office/word/2012/wordml" xmlns:w16cex="http://schemas.microsoft.com/office/word/2018/wordml/cex" xmlns:w16cid="http://schemas.microsoft.com/office/word/2016/wordml/cid" xmlns:w16="http://schemas.microsoft.com/office/word/2018/wordml" xmlns:w16du="http://schemas.microsoft.com/office/word/2023/wordml/word16du" xmlns:w16sdtdh="http://schemas.microsoft.com/office/word/2020/wordml/sdtdatahash" xmlns:w16sdtfl="http://schemas.microsoft.com/office/word/2024/wordml/sdtformatlock" xmlns:w16se="http://schemas.microsoft.com/office/word/2015/wordml/symex" xmlns:wpg="http://schemas.microsoft.com/office/word/2010/wordprocessingGroup" xmlns:wpi="http://schemas.microsoft.com/office/word/2010/wordprocessingInk" xmlns:wne="http://schemas.microsoft.com/office/word/2006/wordml" xmlns:wps="http://schemas.microsoft.com/office/word/2010/wordprocessingShape" mc:Ignorable="w14 w15 w16se w16cid w16 w16cex w16sdtdh w16sdtfl w16du wp14">
+  <w:p>
+    <w:pPr>
+      <w:pStyle w:val="Encabezado"/>
+    </w:pPr>
+  </w:p>
+</w:hdr>
+</file>
+
+<file path=word/header2.xml><?xml version="1.0" encoding="utf-8"?>
+<w:hdr xmlns:wpc="http://schemas.microsoft.com/office/word/2010/wordprocessingCanvas" xmlns:cx="http://schemas.microsoft.com/office/drawing/2014/chartex" xmlns:cx1="http://schemas.microsoft.com/office/drawing/2015/9/8/chartex" xmlns:cx2="http://schemas.microsoft.com/office/drawing/2015/10/21/chartex" xmlns:cx3="http://schemas.microsoft.com/office/drawing/2016/5/9/chartex" xmlns:cx4="http://schemas.microsoft.com/office/drawing/2016/5/10/chartex" xmlns:cx5="http://schemas.microsoft.com/office/drawing/2016/5/11/chartex" xmlns:cx6="http://schemas.microsoft.com/office/drawing/2016/5/12/chartex" xmlns:cx7="http://schemas.microsoft.com/office/drawing/2016/5/13/chartex" xmlns:cx8="http://schemas.microsoft.com/office/drawing/2016/5/14/chartex" xmlns:mc="http://schemas.openxmlformats.org/markup-compatibility/2006" xmlns:aink="http://schemas.microsoft.com/office/drawing/2016/ink" xmlns:am3d="http://schemas.microsoft.com/office/drawing/2017/model3d" xmlns:o="urn:schemas-microsoft-com:office:office" xmlns:oel="http://schemas.microsoft.com/office/2019/extlst" xmlns:r="http://schemas.openxmlformats.org/officeDocument/2006/relationships" xmlns:m="http://schemas.openxmlformats.org/officeDocument/2006/math" xmlns:v="urn:schemas-microsoft-com:vml" xmlns:wp14="http://schemas.microsoft.com/office/word/2010/wordprocessingDrawing" xmlns:wp="http://schemas.openxmlformats.org/drawingml/2006/wordprocessingDrawing" xmlns:w10="urn:schemas-microsoft-com:office:word" xmlns:w="http://schemas.openxmlformats.org/wordprocessingml/2006/main" xmlns:w14="http://schemas.microsoft.com/office/word/2010/wordml" xmlns:w15="http://schemas.microsoft.com/office/word/2012/wordml" xmlns:w16cex="http://schemas.microsoft.com/office/word/2018/wordml/cex" xmlns:w16cid="http://schemas.microsoft.com/office/word/2016/wordml/cid" xmlns:w16="http://schemas.microsoft.com/office/word/2018/wordml" xmlns:w16du="http://schemas.microsoft.com/office/word/2023/wordml/word16du" xmlns:w16sdtdh="http://schemas.microsoft.com/office/word/2020/wordml/sdtdatahash" xmlns:w16sdtfl="http://schemas.microsoft.com/office/word/2024/wordml/sdtformatlock" xmlns:w16se="http://schemas.microsoft.com/office/word/2015/wordml/symex" xmlns:wpg="http://schemas.microsoft.com/office/word/2010/wordprocessingGroup" xmlns:wpi="http://schemas.microsoft.com/office/word/2010/wordprocessingInk" xmlns:wne="http://schemas.microsoft.com/office/word/2006/wordml" xmlns:wps="http://schemas.microsoft.com/office/word/2010/wordprocessingShape" mc:Ignorable="w14 w15 w16se w16cid w16 w16cex w16sdtdh w16sdtfl w16du wp14">
+  <w:p>
+    <w:pPr>
+      <w:pStyle w:val="Encabezado"/>
+    </w:pPr>
+  </w:p>
+</w:hdr>
+</file>
+
+<file path=word/header3.xml><?xml version="1.0" encoding="utf-8"?>
+<w:hdr xmlns:wpc="http://schemas.microsoft.com/office/word/2010/wordprocessingCanvas" xmlns:cx="http://schemas.microsoft.com/office/drawing/2014/chartex" xmlns:cx1="http://schemas.microsoft.com/office/drawing/2015/9/8/chartex" xmlns:cx2="http://schemas.microsoft.com/office/drawing/2015/10/21/chartex" xmlns:cx3="http://schemas.microsoft.com/office/drawing/2016/5/9/chartex" xmlns:cx4="http://schemas.microsoft.com/office/drawing/2016/5/10/chartex" xmlns:cx5="http://schemas.microsoft.com/office/drawing/2016/5/11/chartex" xmlns:cx6="http://schemas.microsoft.com/office/drawing/2016/5/12/chartex" xmlns:cx7="http://schemas.microsoft.com/office/drawing/2016/5/13/chartex" xmlns:cx8="http://schemas.microsoft.com/office/drawing/2016/5/14/chartex" xmlns:mc="http://schemas.openxmlformats.org/markup-compatibility/2006" xmlns:aink="http://schemas.microsoft.com/office/drawing/2016/ink" xmlns:am3d="http://schemas.microsoft.com/office/drawing/2017/model3d" xmlns:o="urn:schemas-microsoft-com:office:office" xmlns:oel="http://schemas.microsoft.com/office/2019/extlst" xmlns:r="http://schemas.openxmlformats.org/officeDocument/2006/relationships" xmlns:m="http://schemas.openxmlformats.org/officeDocument/2006/math" xmlns:v="urn:schemas-microsoft-com:vml" xmlns:wp14="http://schemas.microsoft.com/office/word/2010/wordprocessingDrawing" xmlns:wp="http://schemas.openxmlformats.org/drawingml/2006/wordprocessingDrawing" xmlns:w10="urn:schemas-microsoft-com:office:word" xmlns:w="http://schemas.openxmlformats.org/wordprocessingml/2006/main" xmlns:w14="http://schemas.microsoft.com/office/word/2010/wordml" xmlns:w15="http://schemas.microsoft.com/office/word/2012/wordml" xmlns:w16cex="http://schemas.microsoft.com/office/word/2018/wordml/cex" xmlns:w16cid="http://schemas.microsoft.com/office/word/2016/wordml/cid" xmlns:w16="http://schemas.microsoft.com/office/word/2018/wordml" xmlns:w16du="http://schemas.microsoft.com/office/word/2023/wordml/word16du" xmlns:w16sdtdh="http://schemas.microsoft.com/office/word/2020/wordml/sdtdatahash" xmlns:w16sdtfl="http://schemas.microsoft.com/office/word/2024/wordml/sdtformatlock" xmlns:w16se="http://schemas.microsoft.com/office/word/2015/wordml/symex" xmlns:wpg="http://schemas.microsoft.com/office/word/2010/wordprocessingGroup" xmlns:wpi="http://schemas.microsoft.com/office/word/2010/wordprocessingInk" xmlns:wne="http://schemas.microsoft.com/office/word/2006/wordml" xmlns:wps="http://schemas.microsoft.com/office/word/2010/wordprocessingShape" mc:Ignorable="w14 w15 w16se w16cid w16 w16cex w16sdtdh w16sdtfl w16du wp14">
+  <w:p>
+    <w:pPr>
+      <w:pStyle w:val="Encabezado"/>
+    </w:pPr>
+  </w:p>
+</w:hdr>
 </file>
 
 <file path=word/numbering.xml><?xml version="1.0" encoding="utf-8"?>
@@ -14730,6 +14941,48 @@
       <w:ind w:left="210"/>
     </w:pPr>
   </w:style>
+  <w:style w:type="paragraph" w:styleId="Encabezado">
+    <w:name w:val="header"/>
+    <w:basedOn w:val="Normal"/>
+    <w:link w:val="EncabezadoCar"/>
+    <w:uiPriority w:val="99"/>
+    <w:unhideWhenUsed/>
+    <w:rsid w:val="00851258"/>
+    <w:pPr>
+      <w:tabs>
+        <w:tab w:val="center" w:pos="4252"/>
+        <w:tab w:val="right" w:pos="8504"/>
+      </w:tabs>
+    </w:pPr>
+  </w:style>
+  <w:style w:type="character" w:customStyle="1" w:styleId="EncabezadoCar">
+    <w:name w:val="Encabezado Car"/>
+    <w:basedOn w:val="Fuentedeprrafopredeter"/>
+    <w:link w:val="Encabezado"/>
+    <w:uiPriority w:val="99"/>
+    <w:rsid w:val="00851258"/>
+  </w:style>
+  <w:style w:type="paragraph" w:styleId="Piedepgina">
+    <w:name w:val="footer"/>
+    <w:basedOn w:val="Normal"/>
+    <w:link w:val="PiedepginaCar"/>
+    <w:uiPriority w:val="99"/>
+    <w:unhideWhenUsed/>
+    <w:rsid w:val="00851258"/>
+    <w:pPr>
+      <w:tabs>
+        <w:tab w:val="center" w:pos="4252"/>
+        <w:tab w:val="right" w:pos="8504"/>
+      </w:tabs>
+    </w:pPr>
+  </w:style>
+  <w:style w:type="character" w:customStyle="1" w:styleId="PiedepginaCar">
+    <w:name w:val="Pie de página Car"/>
+    <w:basedOn w:val="Fuentedeprrafopredeter"/>
+    <w:link w:val="Piedepgina"/>
+    <w:uiPriority w:val="99"/>
+    <w:rsid w:val="00851258"/>
+  </w:style>
 </w:styles>
 </file>
 

</xml_diff>

<commit_message>
Herramienta propia de usabilidad en lugar de Maze en los documentos
- Esquema, Plan de Pruebas, Plan de Calidad, Informe de HU y presentación
  del esquema: las menciones a Maze pasan a la herramienta propia
  (usabilidad.html).
- Nuevo documento de análisis de requerimientos, HU y resumen de planes.
- Presentación ampliada a 35 diapositivas.
- referencias/ excluida de git.
</commit_message>
<xml_diff>
--- a/docs/Esquema_Calidad_Pruebas_Conformidad.docx
+++ b/docs/Esquema_Calidad_Pruebas_Conformidad.docx
@@ -3461,7 +3461,7 @@
                 <w:sz w:val="19"/>
                 <w:szCs w:val="19"/>
               </w:rPr>
-              <w:t>Valida la usabilidad (Maze) y las pruebas de aceptación.</w:t>
+              <w:t>Valida la usabilidad (herramienta propia) y las pruebas de aceptación.</w:t>
             </w:r>
           </w:p>
         </w:tc>
@@ -4384,7 +4384,7 @@
                 <w:sz w:val="19"/>
                 <w:szCs w:val="19"/>
               </w:rPr>
-              <w:t>Tareas completadas ÷ tareas intentadas (Maze)</w:t>
+              <w:t>Tareas completadas ÷ tareas intentadas (herramienta propia)</w:t>
             </w:r>
           </w:p>
         </w:tc>
@@ -4479,7 +4479,7 @@
                 <w:sz w:val="19"/>
                 <w:szCs w:val="19"/>
               </w:rPr>
-              <w:t>Cuestionario SUS al final de la prueba en Maze</w:t>
+              <w:t>Cuestionario SUS al final de la prueba con la herramienta propia</w:t>
             </w:r>
           </w:p>
         </w:tc>
@@ -5037,7 +5037,7 @@
         <w:t xml:space="preserve">Pruebas planificadas: </w:t>
       </w:r>
       <w:r>
-        <w:t>unitarias automatizadas, integración, sistema, aceptación, usabilidad (Maze) y conformidad (ver Partes II y III).</w:t>
+        <w:t>unitarias automatizadas, integración, sistema, aceptación, usabilidad (herramienta propia) y conformidad (ver Partes II y III).</w:t>
       </w:r>
     </w:p>
     <w:p>
@@ -5360,7 +5360,7 @@
                 <w:sz w:val="19"/>
                 <w:szCs w:val="19"/>
               </w:rPr>
-              <w:t>Maze (prueba no moderada sobre la URL de GitHub Pages)</w:t>
+              <w:t>Herramienta propia usabilidad.html (prueba no moderada sobre la URL de GitHub Pages)</w:t>
             </w:r>
           </w:p>
         </w:tc>
@@ -5540,7 +5540,7 @@
         <w:spacing w:after="60"/>
       </w:pPr>
       <w:r>
-        <w:t>Pruebas de aceptación de usuario (UAT) aprobadas en Maze: tasa de éxito ≥ 80 % y SUS ≥ 68.</w:t>
+        <w:t>Pruebas de aceptación de usuario (UAT) aprobadas con la herramienta propia: tasa de éxito ≥ 80 % y SUS ≥ 68.</w:t>
       </w:r>
     </w:p>
     <w:p>
@@ -6148,7 +6148,7 @@
                 <w:sz w:val="19"/>
                 <w:szCs w:val="19"/>
               </w:rPr>
-              <w:t>Maze + checklist</w:t>
+              <w:t>Herramienta propia + checklist</w:t>
             </w:r>
           </w:p>
         </w:tc>
@@ -6679,7 +6679,7 @@
                 <w:sz w:val="19"/>
                 <w:szCs w:val="19"/>
               </w:rPr>
-              <w:t>Maze: tareas + cuestionario SUS</w:t>
+              <w:t>Herramienta propia: tareas + cuestionario SUS</w:t>
             </w:r>
           </w:p>
         </w:tc>
@@ -9012,7 +9012,7 @@
                 <w:sz w:val="19"/>
                 <w:szCs w:val="19"/>
               </w:rPr>
-              <w:t>Compañeros de curso y docente: ejecutan las tareas de usabilidad en Maze y validan la aceptación (UAT).</w:t>
+              <w:t>Compañeros de curso y docente: ejecutan las tareas de usabilidad con la herramienta propia y validan la aceptación (UAT).</w:t>
             </w:r>
           </w:p>
         </w:tc>
@@ -9110,7 +9110,7 @@
                 <w:sz w:val="19"/>
                 <w:szCs w:val="19"/>
               </w:rPr>
-              <w:t>tests.html (unitarias), Chrome DevTools y Lighthouse (rendimiento, accesibilidad, responsive), Maze (usabilidad), GitHub Issues (defectos).</w:t>
+              <w:t>tests.html (unitarias), Chrome DevTools y Lighthouse (rendimiento, accesibilidad, responsive), herramienta propia usabilidad.html (usabilidad), GitHub Issues (defectos).</w:t>
             </w:r>
           </w:p>
         </w:tc>
@@ -9524,7 +9524,7 @@
                 <w:sz w:val="19"/>
                 <w:szCs w:val="19"/>
               </w:rPr>
-              <w:t>Usabilidad con Maze (UAT)</w:t>
+              <w:t>Usabilidad con la herramienta propia (UAT)</w:t>
             </w:r>
           </w:p>
         </w:tc>
@@ -9870,7 +9870,7 @@
                 <w:sz w:val="19"/>
                 <w:szCs w:val="19"/>
               </w:rPr>
-              <w:t>Pocos participantes para la prueba en Maze.</w:t>
+              <w:t>Pocos participantes para la prueba con la herramienta propia.</w:t>
             </w:r>
           </w:p>
         </w:tc>
@@ -10057,7 +10057,7 @@
         <w:spacing w:after="60"/>
       </w:pPr>
       <w:r>
-        <w:t>Los usuarios clave validaron la aceptación (UAT) en Maze: tasa de éxito de tareas ≥ 80 % y SUS ≥ 68.</w:t>
+        <w:t>Los usuarios clave validaron la aceptación (UAT) con la herramienta propia: tasa de éxito de tareas ≥ 80 % y SUS ≥ 68.</w:t>
       </w:r>
     </w:p>
     <w:p>
@@ -13968,7 +13968,7 @@
         <w:t xml:space="preserve">Próximos pasos: </w:t>
       </w:r>
       <w:r>
-        <w:t>este esquema sirve de base para los entregables completos del Plan de Calidad, el Plan de Pruebas y la Prueba de Conformidad, donde se ejecutarán los casos, se registrarán los resultados y evidencias (capturas), se completará la prueba de usabilidad en Maze y se consolidarán las métricas en el informe final.</w:t>
+        <w:t>este esquema sirve de base para los entregables completos del Plan de Calidad, el Plan de Pruebas y la Prueba de Conformidad, donde se ejecutarán los casos, se registrarán los resultados y evidencias (capturas), se completará la prueba de usabilidad con la herramienta propia y se consolidarán las métricas en el informe final.</w:t>
       </w:r>
     </w:p>
     <w:sectPr>

</xml_diff>